<commit_message>
Add source cards and mentor companion brief
</commit_message>
<xml_diff>
--- a/docs/project_blueprints/North_Slope_Gas_Hydrate_ML_Pipeline_Status_And_Forward_Workflow_2026-06-15.docx
+++ b/docs/project_blueprints/North_Slope_Gas_Hydrate_ML_Pipeline_Status_And_Forward_Workflow_2026-06-15.docx
@@ -7,12 +7,12 @@
         <w:pStyle w:val="Title"/>
       </w:pPr>
       <w:r>
-        <w:t>North Slope Gas Hydrate ML Pipeline Status And Forward Workflow</w:t>
+        <w:t>North Slope Gas Hydrate Mentor Companion Brief</w:t>
       </w:r>
     </w:p>
     <w:p>
       <w:r>
-        <w:t>Created: 2026-06-15</w:t>
+        <w:t>Created: 2026-06-15 Updated: 2026-06-16</w:t>
       </w:r>
     </w:p>
     <w:p>
@@ -25,42 +25,12 @@
     </w:p>
     <w:p>
       <w:r>
-        <w:t>This brief explains where the project stands right now and how the current</w:t>
+        <w:t>This brief explains where the project stands now for mentor review. It connects the public website, source-backed stability screen, V5.4 workflow package, and the first DOE three-dataset prototype without claiming final hydrate proof, final stability, occurrence prediction, saturation prediction, or validated model performance.</w:t>
       </w:r>
     </w:p>
     <w:p>
       <w:r>
-        <w:t>work leads to the final machine-learning workflow for North Slope gas hydrate</w:t>
-      </w:r>
-    </w:p>
-    <w:p>
-      <w:r>
-        <w:t>occurrence and saturation. It is written as a Word-document-ready narrative for</w:t>
-      </w:r>
-    </w:p>
-    <w:p>
-      <w:r>
-        <w:t>mentor review, project planning, and later alignment with the slide deck.</w:t>
-      </w:r>
-    </w:p>
-    <w:p>
-      <w:r>
-        <w:t>The project is not claiming a trained model result yet. The current defensible</w:t>
-      </w:r>
-    </w:p>
-    <w:p>
-      <w:r>
-        <w:t>claim is that the team has built a public-safe scaffold, a cited</w:t>
-      </w:r>
-    </w:p>
-    <w:p>
-      <w:r>
-        <w:t>pressure-temperature stability-admissibility screen, and the structure for a</w:t>
-      </w:r>
-    </w:p>
-    <w:p>
-      <w:r>
-        <w:t>future approved-data ML workflow.</w:t>
+        <w:t>The current defensible claim is that the project has a public-safe source and method scaffold plus an approved-runtime prototype that can audit target leakage and feature construction. The value today is traceability and controlled workflow design, not a final R2 value.</w:t>
       </w:r>
     </w:p>
     <w:p>
@@ -68,27 +38,17 @@
         <w:pStyle w:val="Heading1"/>
       </w:pPr>
       <w:r>
-        <w:t>One-Sentence Status</w:t>
+        <w:t>Project Vision And Goal</w:t>
       </w:r>
     </w:p>
     <w:p>
       <w:r>
-        <w:t>The project has moved from a general gas-hydrate ML idea into a controlled</w:t>
+        <w:t>The project goal is to build a scientifically defensible North Slope gas hydrate workflow for future occurrence classification and saturation regression. The workflow should follow the same logic a geoscientist would use: first test whether methane hydrate is physically admissible, then check whether the interval can host pore-filling hydrate, then evaluate whether well logs and core or NMR context show a hydrate-compatible response.</w:t>
       </w:r>
     </w:p>
     <w:p>
       <w:r>
-        <w:t>workflow: public GitHub/Streamlit explains the method and displays public-safe</w:t>
-      </w:r>
-    </w:p>
-    <w:p>
-      <w:r>
-        <w:t>stability status, while OpenScienceLab is the heavy-data workbench for source</w:t>
-      </w:r>
-    </w:p>
-    <w:p>
-      <w:r>
-        <w:t>bundles, guarded calculations, and later approved well-log/core execution.</w:t>
+        <w:t>The target system remains pore-filling methane hydrate in sand-rich, permafrost-associated Alaska North Slope reservoirs. The public website and documents explain the method. Final model execution belongs in the DOE or other approved runtime after data access, label authority, and validation policy are settled.</w:t>
       </w:r>
     </w:p>
     <w:p>
@@ -96,7 +56,7 @@
         <w:pStyle w:val="Heading1"/>
       </w:pPr>
       <w:r>
-        <w:t>Current Project Position</w:t>
+        <w:t>Current Position</w:t>
       </w:r>
     </w:p>
     <w:tbl>
@@ -152,7 +112,7 @@
                 <w:b/>
                 <w:sz w:val="18"/>
               </w:rPr>
-              <w:t>What it means</w:t>
+              <w:t>Mentor-ready meaning</w:t>
             </w:r>
           </w:p>
         </w:tc>
@@ -168,7 +128,7 @@
                 <w:rFonts w:ascii="Arial" w:hAnsi="Arial"/>
                 <w:sz w:val="18"/>
               </w:rPr>
-              <w:t>Public delivery surface</w:t>
+              <w:t>Public website and GitHub</w:t>
             </w:r>
           </w:p>
         </w:tc>
@@ -182,7 +142,7 @@
                 <w:rFonts w:ascii="Arial" w:hAnsi="Arial"/>
                 <w:sz w:val="18"/>
               </w:rPr>
-              <w:t>GitHub repository and Streamlit app are the public-facing scaffold.</w:t>
+              <w:t>Public GIS, source cards, stability products, schema templates, diagrams, and tests are available.</w:t>
             </w:r>
           </w:p>
         </w:tc>
@@ -196,7 +156,7 @@
                 <w:rFonts w:ascii="Arial" w:hAnsi="Arial"/>
                 <w:sz w:val="18"/>
               </w:rPr>
-              <w:t>Public users can see source-backed GIS context, diagrams, public CSV summaries, and workflow status.</w:t>
+              <w:t>The public side explains the method and provenance without exposing approved rows.</w:t>
             </w:r>
           </w:p>
         </w:tc>
@@ -212,7 +172,7 @@
                 <w:rFonts w:ascii="Arial" w:hAnsi="Arial"/>
                 <w:sz w:val="18"/>
               </w:rPr>
-              <w:t>Heavy-data workbench</w:t>
+              <w:t>Source and visual provenance</w:t>
             </w:r>
           </w:p>
         </w:tc>
@@ -226,7 +186,7 @@
                 <w:rFonts w:ascii="Arial" w:hAnsi="Arial"/>
                 <w:sz w:val="18"/>
               </w:rPr>
-              <w:t>OpenScienceLab is the place for raw source bundles, G10015 profile rows, approved runtime inputs, and guarded calculations.</w:t>
+              <w:t>`source_visual_inventory_2026-06-16.csv` tracks slide panels, website captures, source-backed images/data, allowed use, and guardrails.</w:t>
             </w:r>
           </w:p>
         </w:tc>
@@ -240,7 +200,7 @@
                 <w:rFonts w:ascii="Arial" w:hAnsi="Arial"/>
                 <w:sz w:val="18"/>
               </w:rPr>
-              <w:t>Large or approved data do not need to live in the public repository.</w:t>
+              <w:t>Visuals now have reuse context instead of being detached illustrations.</w:t>
             </w:r>
           </w:p>
         </w:tc>
@@ -256,7 +216,7 @@
                 <w:rFonts w:ascii="Arial" w:hAnsi="Arial"/>
                 <w:sz w:val="18"/>
               </w:rPr>
-              <w:t>Public well scaffold</w:t>
+              <w:t>Stability screen</w:t>
             </w:r>
           </w:p>
         </w:tc>
@@ -270,7 +230,7 @@
                 <w:rFonts w:ascii="Arial" w:hAnsi="Arial"/>
                 <w:sz w:val="18"/>
               </w:rPr>
-              <w:t>The current stability scaffold has 8,084 Arctic Slope public wells.</w:t>
+              <w:t>The public methane 5 ppt screen has 8,084 scaffold rows, including 22 calculated admissibility intervals, 8 no-stable-interval rows, and 8,054 blocked rows.</w:t>
             </w:r>
           </w:p>
         </w:tc>
@@ -284,7 +244,7 @@
                 <w:rFonts w:ascii="Arial" w:hAnsi="Arial"/>
                 <w:sz w:val="18"/>
               </w:rPr>
-              <w:t>This is a public screening inventory, not an approved runtime well-log inventory.</w:t>
+              <w:t>This is pressure-temperature admissibility under stated assumptions only.</w:t>
             </w:r>
           </w:p>
         </w:tc>
@@ -300,7 +260,7 @@
                 <w:rFonts w:ascii="Arial" w:hAnsi="Arial"/>
                 <w:sz w:val="18"/>
               </w:rPr>
-              <w:t>Temperature inventory</w:t>
+              <w:t>Approved data visibility</w:t>
             </w:r>
           </w:p>
         </w:tc>
@@ -314,7 +274,7 @@
                 <w:rFonts w:ascii="Arial" w:hAnsi="Arial"/>
                 <w:sz w:val="18"/>
               </w:rPr>
-              <w:t>G10015 intake reports 184 temperature profiles across 24 well codes.</w:t>
+              <w:t>About 3 of the expected 71 approved datasets are currently visible for schema and runtime-prototype work.</w:t>
             </w:r>
           </w:p>
         </w:tc>
@@ -328,7 +288,7 @@
                 <w:rFonts w:ascii="Arial" w:hAnsi="Arial"/>
                 <w:sz w:val="18"/>
               </w:rPr>
-              <w:t>The temperature source layer exists, but raw profile rows remain a workbench/source-bundle input.</w:t>
+              <w:t>Enough for pipeline structure, feature audit, and target-leakage checks; not enough for final claims.</w:t>
             </w:r>
           </w:p>
         </w:tc>
@@ -344,7 +304,7 @@
                 <w:rFonts w:ascii="Arial" w:hAnsi="Arial"/>
                 <w:sz w:val="18"/>
               </w:rPr>
-              <w:t>Temperature-model product</w:t>
+              <w:t>DOE prototype</w:t>
             </w:r>
           </w:p>
         </w:tc>
@@ -358,7 +318,7 @@
                 <w:rFonts w:ascii="Arial" w:hAnsi="Arial"/>
                 <w:sz w:val="18"/>
               </w:rPr>
-              <w:t>16,168 key-depth rows: 919 calculated, 387 extrapolated, 15,249 blocked, and 0 final stability results.</w:t>
+              <w:t>Three workbooks can be scanned and routed through a local runtime workflow with dataset 1 as training and datasets 2 and 3 as external/test-style inputs when targets exist.</w:t>
             </w:r>
           </w:p>
         </w:tc>
@@ -372,7 +332,7 @@
                 <w:rFonts w:ascii="Arial" w:hAnsi="Arial"/>
                 <w:sz w:val="18"/>
               </w:rPr>
-              <w:t>This product models temperature inputs only; blocked rows are data-readiness status, not no-hydrate conclusions.</w:t>
+              <w:t>Useful as an audit trail and plumbing proof, not validated science performance.</w:t>
             </w:r>
           </w:p>
         </w:tc>
@@ -388,7 +348,7 @@
                 <w:rFonts w:ascii="Arial" w:hAnsi="Arial"/>
                 <w:sz w:val="18"/>
               </w:rPr>
-              <w:t>Guarded stability screen</w:t>
+              <w:t>Current deliverables</w:t>
             </w:r>
           </w:p>
         </w:tc>
@@ -402,7 +362,7 @@
                 <w:rFonts w:ascii="Arial" w:hAnsi="Arial"/>
                 <w:sz w:val="18"/>
               </w:rPr>
-              <w:t>Baseline methane 5 ppt run has 8,084 rows: 22 calculated admissibility intervals, 8 sufficient-input rows with no modeled stable interval, and 8,054 blocked rows.</w:t>
+              <w:t>V5.4 corrected slides, Word companion, website sections, source cards, and model-run tracker language are aligned around guardrails.</w:t>
             </w:r>
           </w:p>
         </w:tc>
@@ -416,51 +376,7 @@
                 <w:rFonts w:ascii="Arial" w:hAnsi="Arial"/>
                 <w:sz w:val="18"/>
               </w:rPr>
-              <w:t>This is a pressure-temperature admissibility screen only. It is not hydrate proof, saturation, or sweet-spot ranking.</w:t>
-            </w:r>
-          </w:p>
-        </w:tc>
-      </w:tr>
-      <w:tr>
-        <w:tc>
-          <w:tcPr>
-            <w:tcW w:type="dxa" w:w="3360"/>
-          </w:tcPr>
-          <w:p>
-            <w:r>
-              <w:rPr>
-                <w:rFonts w:ascii="Arial" w:hAnsi="Arial"/>
-                <w:sz w:val="18"/>
-              </w:rPr>
-              <w:t>Deliverables</w:t>
-            </w:r>
-          </w:p>
-        </w:tc>
-        <w:tc>
-          <w:tcPr>
-            <w:tcW w:type="dxa" w:w="3360"/>
-          </w:tcPr>
-          <w:p>
-            <w:r>
-              <w:rPr>
-                <w:rFonts w:ascii="Arial" w:hAnsi="Arial"/>
-                <w:sz w:val="18"/>
-              </w:rPr>
-              <w:t>Communication drafts, a weekday report template, a deliverable refresh plan, and a 9-slide local remake draft now exist.</w:t>
-            </w:r>
-          </w:p>
-        </w:tc>
-        <w:tc>
-          <w:tcPr>
-            <w:tcW w:type="dxa" w:w="3360"/>
-          </w:tcPr>
-          <w:p>
-            <w:r>
-              <w:rPr>
-                <w:rFonts w:ascii="Arial" w:hAnsi="Arial"/>
-                <w:sz w:val="18"/>
-              </w:rPr>
-              <w:t>The Word document and slides can now explain the public/OSL split, stability screen, and future ML path consistently.</w:t>
+              <w:t>The mentor can review the method, boundary, current blockers, and decision requests.</w:t>
             </w:r>
           </w:p>
         </w:tc>
@@ -472,522 +388,12 @@
         <w:pStyle w:val="Heading1"/>
       </w:pPr>
       <w:r>
-        <w:t>Scientific Target</w:t>
+        <w:t>Public Versus DOE/Approved Runtime Boundary</w:t>
       </w:r>
     </w:p>
     <w:p>
       <w:r>
-        <w:t>The working target is pore-filling methane hydrate in sand-rich,</w:t>
-      </w:r>
-    </w:p>
-    <w:p>
-      <w:r>
-        <w:t>permafrost-associated reservoirs on the Alaska North Slope. That target matters</w:t>
-      </w:r>
-    </w:p>
-    <w:p>
-      <w:r>
-        <w:t>because it gives the ML workflow a defensible order:</w:t>
-      </w:r>
-    </w:p>
-    <w:p>
-      <w:pPr/>
-      <w:r>
-        <w:rPr>
-          <w:rFonts w:ascii="Consolas" w:hAnsi="Consolas"/>
-          <w:sz w:val="18"/>
-        </w:rPr>
-        <w:t>stability context</w:t>
-        <w:br/>
-        <w:t>-&gt; reservoir quality</w:t>
-        <w:br/>
-        <w:t>-&gt; hydrate response</w:t>
-        <w:br/>
-        <w:t>-&gt; occurrence classification and saturation regression</w:t>
-      </w:r>
-    </w:p>
-    <w:p>
-      <w:r>
-        <w:t>The model should not be asked to "magically find hydrates" from a flat</w:t>
-      </w:r>
-    </w:p>
-    <w:p>
-      <w:r>
-        <w:t>spreadsheet. It should encode the same sequence a geoscientist would use:</w:t>
-      </w:r>
-    </w:p>
-    <w:p>
-      <w:r>
-        <w:t>first test whether hydrate could exist, then whether the rock can host it, and</w:t>
-      </w:r>
-    </w:p>
-    <w:p>
-      <w:r>
-        <w:t>then whether the logs show an electrical, elastic, porosity, NMR, or core</w:t>
-      </w:r>
-    </w:p>
-    <w:p>
-      <w:r>
-        <w:t>response consistent with hydrate-bearing sediment.</w:t>
-      </w:r>
-    </w:p>
-    <w:p>
-      <w:pPr>
-        <w:pStyle w:val="Heading1"/>
-      </w:pPr>
-      <w:r>
-        <w:t>Evidence Tiers</w:t>
-      </w:r>
-    </w:p>
-    <w:tbl>
-      <w:tblPr>
-        <w:tblStyle w:val="TableGrid"/>
-        <w:tblW w:type="auto" w:w="0"/>
-        <w:tblLook w:firstColumn="1" w:firstRow="1" w:lastColumn="0" w:lastRow="0" w:noHBand="0" w:noVBand="1" w:val="04A0"/>
-      </w:tblPr>
-      <w:tblGrid>
-        <w:gridCol w:w="2520"/>
-        <w:gridCol w:w="2520"/>
-        <w:gridCol w:w="2520"/>
-        <w:gridCol w:w="2520"/>
-      </w:tblGrid>
-      <w:tr>
-        <w:tc>
-          <w:tcPr>
-            <w:tcW w:type="dxa" w:w="2520"/>
-          </w:tcPr>
-          <w:p>
-            <w:r>
-              <w:rPr>
-                <w:rFonts w:ascii="Arial" w:hAnsi="Arial"/>
-                <w:b/>
-                <w:sz w:val="18"/>
-              </w:rPr>
-              <w:t>Tier</w:t>
-            </w:r>
-          </w:p>
-        </w:tc>
-        <w:tc>
-          <w:tcPr>
-            <w:tcW w:type="dxa" w:w="2520"/>
-          </w:tcPr>
-          <w:p>
-            <w:r>
-              <w:rPr>
-                <w:rFonts w:ascii="Arial" w:hAnsi="Arial"/>
-                <w:b/>
-                <w:sz w:val="18"/>
-              </w:rPr>
-              <w:t>Main question</w:t>
-            </w:r>
-          </w:p>
-        </w:tc>
-        <w:tc>
-          <w:tcPr>
-            <w:tcW w:type="dxa" w:w="2520"/>
-          </w:tcPr>
-          <w:p>
-            <w:r>
-              <w:rPr>
-                <w:rFonts w:ascii="Arial" w:hAnsi="Arial"/>
-                <w:b/>
-                <w:sz w:val="18"/>
-              </w:rPr>
-              <w:t>Inputs or evidence</w:t>
-            </w:r>
-          </w:p>
-        </w:tc>
-        <w:tc>
-          <w:tcPr>
-            <w:tcW w:type="dxa" w:w="2520"/>
-          </w:tcPr>
-          <w:p>
-            <w:r>
-              <w:rPr>
-                <w:rFonts w:ascii="Arial" w:hAnsi="Arial"/>
-                <w:b/>
-                <w:sz w:val="18"/>
-              </w:rPr>
-              <w:t>ML role</w:t>
-            </w:r>
-          </w:p>
-        </w:tc>
-      </w:tr>
-      <w:tr>
-        <w:tc>
-          <w:tcPr>
-            <w:tcW w:type="dxa" w:w="2520"/>
-          </w:tcPr>
-          <w:p>
-            <w:r>
-              <w:rPr>
-                <w:rFonts w:ascii="Arial" w:hAnsi="Arial"/>
-                <w:sz w:val="18"/>
-              </w:rPr>
-              <w:t>Stability context</w:t>
-            </w:r>
-          </w:p>
-        </w:tc>
-        <w:tc>
-          <w:tcPr>
-            <w:tcW w:type="dxa" w:w="2520"/>
-          </w:tcPr>
-          <w:p>
-            <w:r>
-              <w:rPr>
-                <w:rFonts w:ascii="Arial" w:hAnsi="Arial"/>
-                <w:sz w:val="18"/>
-              </w:rPr>
-              <w:t>Could methane hydrate be stable here?</w:t>
-            </w:r>
-          </w:p>
-        </w:tc>
-        <w:tc>
-          <w:tcPr>
-            <w:tcW w:type="dxa" w:w="2520"/>
-          </w:tcPr>
-          <w:p>
-            <w:r>
-              <w:rPr>
-                <w:rFonts w:ascii="Arial" w:hAnsi="Arial"/>
-                <w:sz w:val="18"/>
-              </w:rPr>
-              <w:t>Depth, pressure, temperature, permafrost context, phase curve, hydrate AU context.</w:t>
-            </w:r>
-          </w:p>
-        </w:tc>
-        <w:tc>
-          <w:tcPr>
-            <w:tcW w:type="dxa" w:w="2520"/>
-          </w:tcPr>
-          <w:p>
-            <w:r>
-              <w:rPr>
-                <w:rFonts w:ascii="Arial" w:hAnsi="Arial"/>
-                <w:sz w:val="18"/>
-              </w:rPr>
-              <w:t>Context feature, mask, or reason flag; never hydrate proof by itself.</w:t>
-            </w:r>
-          </w:p>
-        </w:tc>
-      </w:tr>
-      <w:tr>
-        <w:tc>
-          <w:tcPr>
-            <w:tcW w:type="dxa" w:w="2520"/>
-          </w:tcPr>
-          <w:p>
-            <w:r>
-              <w:rPr>
-                <w:rFonts w:ascii="Arial" w:hAnsi="Arial"/>
-                <w:sz w:val="18"/>
-              </w:rPr>
-              <w:t>Reservoir quality</w:t>
-            </w:r>
-          </w:p>
-        </w:tc>
-        <w:tc>
-          <w:tcPr>
-            <w:tcW w:type="dxa" w:w="2520"/>
-          </w:tcPr>
-          <w:p>
-            <w:r>
-              <w:rPr>
-                <w:rFonts w:ascii="Arial" w:hAnsi="Arial"/>
-                <w:sz w:val="18"/>
-              </w:rPr>
-              <w:t>Can the interval host pore-filling hydrate?</w:t>
-            </w:r>
-          </w:p>
-        </w:tc>
-        <w:tc>
-          <w:tcPr>
-            <w:tcW w:type="dxa" w:w="2520"/>
-          </w:tcPr>
-          <w:p>
-            <w:r>
-              <w:rPr>
-                <w:rFonts w:ascii="Arial" w:hAnsi="Arial"/>
-                <w:sz w:val="18"/>
-              </w:rPr>
-              <w:t>Gamma ray, porosity, density, lithology, caliper QC, core reservoir quality.</w:t>
-            </w:r>
-          </w:p>
-        </w:tc>
-        <w:tc>
-          <w:tcPr>
-            <w:tcW w:type="dxa" w:w="2520"/>
-          </w:tcPr>
-          <w:p>
-            <w:r>
-              <w:rPr>
-                <w:rFonts w:ascii="Arial" w:hAnsi="Arial"/>
-                <w:sz w:val="18"/>
-              </w:rPr>
-              <w:t>Reservoir gate and feature block.</w:t>
-            </w:r>
-          </w:p>
-        </w:tc>
-      </w:tr>
-      <w:tr>
-        <w:tc>
-          <w:tcPr>
-            <w:tcW w:type="dxa" w:w="2520"/>
-          </w:tcPr>
-          <w:p>
-            <w:r>
-              <w:rPr>
-                <w:rFonts w:ascii="Arial" w:hAnsi="Arial"/>
-                <w:sz w:val="18"/>
-              </w:rPr>
-              <w:t>Hydrate response</w:t>
-            </w:r>
-          </w:p>
-        </w:tc>
-        <w:tc>
-          <w:tcPr>
-            <w:tcW w:type="dxa" w:w="2520"/>
-          </w:tcPr>
-          <w:p>
-            <w:r>
-              <w:rPr>
-                <w:rFonts w:ascii="Arial" w:hAnsi="Arial"/>
-                <w:sz w:val="18"/>
-              </w:rPr>
-              <w:t>Does the interval behave like hydrate-bearing sediment?</w:t>
-            </w:r>
-          </w:p>
-        </w:tc>
-        <w:tc>
-          <w:tcPr>
-            <w:tcW w:type="dxa" w:w="2520"/>
-          </w:tcPr>
-          <w:p>
-            <w:r>
-              <w:rPr>
-                <w:rFonts w:ascii="Arial" w:hAnsi="Arial"/>
-                <w:sz w:val="18"/>
-              </w:rPr>
-              <w:t>Resistivity, `V_p`, `V_s`, `V_p/V_s`, acoustic impedance, `lambda-rho`, `mu-rho`, NMR/core support.</w:t>
-            </w:r>
-          </w:p>
-        </w:tc>
-        <w:tc>
-          <w:tcPr>
-            <w:tcW w:type="dxa" w:w="2520"/>
-          </w:tcPr>
-          <w:p>
-            <w:r>
-              <w:rPr>
-                <w:rFonts w:ascii="Arial" w:hAnsi="Arial"/>
-                <w:sz w:val="18"/>
-              </w:rPr>
-              <w:t>Main multilog response block for occurrence and saturation models.</w:t>
-            </w:r>
-          </w:p>
-        </w:tc>
-      </w:tr>
-      <w:tr>
-        <w:tc>
-          <w:tcPr>
-            <w:tcW w:type="dxa" w:w="2520"/>
-          </w:tcPr>
-          <w:p>
-            <w:r>
-              <w:rPr>
-                <w:rFonts w:ascii="Arial" w:hAnsi="Arial"/>
-                <w:sz w:val="18"/>
-              </w:rPr>
-              <w:t>Targets and validation</w:t>
-            </w:r>
-          </w:p>
-        </w:tc>
-        <w:tc>
-          <w:tcPr>
-            <w:tcW w:type="dxa" w:w="2520"/>
-          </w:tcPr>
-          <w:p>
-            <w:r>
-              <w:rPr>
-                <w:rFonts w:ascii="Arial" w:hAnsi="Arial"/>
-                <w:sz w:val="18"/>
-              </w:rPr>
-              <w:t>What is the answer column?</w:t>
-            </w:r>
-          </w:p>
-        </w:tc>
-        <w:tc>
-          <w:tcPr>
-            <w:tcW w:type="dxa" w:w="2520"/>
-          </w:tcPr>
-          <w:p>
-            <w:r>
-              <w:rPr>
-                <w:rFonts w:ascii="Arial" w:hAnsi="Arial"/>
-                <w:sz w:val="18"/>
-              </w:rPr>
-              <w:t>`S_h`, `Sgh`, `NMR_SAT`, phase labels, interpreted saturation, core/NMR calibration.</w:t>
-            </w:r>
-          </w:p>
-        </w:tc>
-        <w:tc>
-          <w:tcPr>
-            <w:tcW w:type="dxa" w:w="2520"/>
-          </w:tcPr>
-          <w:p>
-            <w:r>
-              <w:rPr>
-                <w:rFonts w:ascii="Arial" w:hAnsi="Arial"/>
-                <w:sz w:val="18"/>
-              </w:rPr>
-              <w:t>Targets, calibration references, or validation overlays only; excluded from predictors.</w:t>
-            </w:r>
-          </w:p>
-        </w:tc>
-      </w:tr>
-    </w:tbl>
-    <w:p/>
-    <w:p>
-      <w:pPr>
-        <w:pStyle w:val="Heading1"/>
-      </w:pPr>
-      <w:r>
-        <w:t>Why Stability Was Built First</w:t>
-      </w:r>
-    </w:p>
-    <w:p>
-      <w:r>
-        <w:t>Gas hydrate stability is necessary but not sufficient. A pressure-temperature</w:t>
-      </w:r>
-    </w:p>
-    <w:p>
-      <w:r>
-        <w:t>screen can say where hydrate could be stable under a stated set of assumptions,</w:t>
-      </w:r>
-    </w:p>
-    <w:p>
-      <w:r>
-        <w:t>but it cannot prove occurrence, estimate saturation, or rank sweet spots. That</w:t>
-      </w:r>
-    </w:p>
-    <w:p>
-      <w:r>
-        <w:t>is why the stability workflow was built as a guarded admissibility layer.</w:t>
-      </w:r>
-    </w:p>
-    <w:p>
-      <w:r>
-        <w:t>The current baseline uses:</w:t>
-      </w:r>
-    </w:p>
-    <w:p>
-      <w:pPr>
-        <w:pStyle w:val="ListBullet"/>
-      </w:pPr>
-      <w:r>
-        <w:t>public well coordinates and depth fields;</w:t>
-      </w:r>
-    </w:p>
-    <w:p>
-      <w:pPr>
-        <w:pStyle w:val="ListBullet"/>
-      </w:pPr>
-      <w:r>
-        <w:t>public permafrost and temperature controls from GGD223 and G10015;</w:t>
-      </w:r>
-    </w:p>
-    <w:p>
-      <w:pPr>
-        <w:pStyle w:val="ListBullet"/>
-      </w:pPr>
-      <w:r>
-        <w:t>a hydrostatic pressure assumption;</w:t>
-      </w:r>
-    </w:p>
-    <w:p>
-      <w:pPr>
-        <w:pStyle w:val="ListBullet"/>
-      </w:pPr>
-      <w:r>
-        <w:t>a digitized USGS SIR 2008 methane hydrate phase boundary for 100 percent</w:t>
-      </w:r>
-    </w:p>
-    <w:p>
-      <w:r>
-        <w:t>methane and 5 ppt salinity;</w:t>
-      </w:r>
-    </w:p>
-    <w:p>
-      <w:pPr>
-        <w:pStyle w:val="ListBullet"/>
-      </w:pPr>
-      <w:r>
-        <w:t>source-control confidence labels; and</w:t>
-      </w:r>
-    </w:p>
-    <w:p>
-      <w:pPr>
-        <w:pStyle w:val="ListBullet"/>
-      </w:pPr>
-      <w:r>
-        <w:t>a guarded writer that leaves rows null when required gates do not pass.</w:t>
-      </w:r>
-    </w:p>
-    <w:p>
-      <w:r>
-        <w:t>The screen result should be described as:</w:t>
-      </w:r>
-    </w:p>
-    <w:p>
-      <w:pPr/>
-      <w:r>
-        <w:rPr>
-          <w:rFonts w:ascii="Consolas" w:hAnsi="Consolas"/>
-          <w:sz w:val="18"/>
-        </w:rPr>
-        <w:t>pressure-temperature stability-admissibility under the selected methane 5 ppt</w:t>
-        <w:br/>
-        <w:t>baseline</w:t>
-      </w:r>
-    </w:p>
-    <w:p>
-      <w:r>
-        <w:t>It should not be described as:</w:t>
-      </w:r>
-    </w:p>
-    <w:p>
-      <w:pPr/>
-      <w:r>
-        <w:rPr>
-          <w:rFonts w:ascii="Consolas" w:hAnsi="Consolas"/>
-          <w:sz w:val="18"/>
-        </w:rPr>
-        <w:t>hydrate proof, saturation, occurrence probability, sweet spot, or final ML</w:t>
-        <w:br/>
-        <w:t>prediction</w:t>
-      </w:r>
-    </w:p>
-    <w:p>
-      <w:pPr>
-        <w:pStyle w:val="Heading1"/>
-      </w:pPr>
-      <w:r>
-        <w:t>Public Repository Versus Approved Runtime Boundary</w:t>
-      </w:r>
-    </w:p>
-    <w:p>
-      <w:r>
-        <w:t>The project has two workspaces because the final science depends on approved</w:t>
-      </w:r>
-    </w:p>
-    <w:p>
-      <w:r>
-        <w:t>well-log and core data that cannot be placed in public GitHub or a public</w:t>
-      </w:r>
-    </w:p>
-    <w:p>
-      <w:r>
-        <w:t>Streamlit app.</w:t>
+        <w:t>The project intentionally uses two workspaces.</w:t>
       </w:r>
     </w:p>
     <w:tbl>
@@ -1043,7 +449,7 @@
                 <w:b/>
                 <w:sz w:val="18"/>
               </w:rPr>
-              <w:t>Not allowed</w:t>
+              <w:t>Not allowed content</w:t>
             </w:r>
           </w:p>
         </w:tc>
@@ -1073,7 +479,7 @@
                 <w:rFonts w:ascii="Arial" w:hAnsi="Arial"/>
                 <w:sz w:val="18"/>
               </w:rPr>
-              <w:t>Public sources, public GIS, public stability summaries, source-backed diagrams, synthetic examples, empty runtime adapters, documentation, and reviewed public-safe outputs.</w:t>
+              <w:t>Public sources, public GIS, public stability summaries, source-backed diagrams, source cards, synthetic examples, schema templates, and reviewed public-safe summaries.</w:t>
             </w:r>
           </w:p>
         </w:tc>
@@ -1087,7 +493,7 @@
                 <w:rFonts w:ascii="Arial" w:hAnsi="Arial"/>
                 <w:sz w:val="18"/>
               </w:rPr>
-              <w:t>Approved LAS/CSV/core rows, restricted identifiers, populated runtime configs, trained models, private labels, or derived sensitive results.</w:t>
+              <w:t>Approved LAS/CSV/core rows, private workbook rows, restricted identifiers, populated runtime configs, trained models, row-level predictions, or sensitive derived outputs.</w:t>
             </w:r>
           </w:p>
         </w:tc>
@@ -1103,7 +509,7 @@
                 <w:rFonts w:ascii="Arial" w:hAnsi="Arial"/>
                 <w:sz w:val="18"/>
               </w:rPr>
-              <w:t>OpenScienceLab / authorized runtime</w:t>
+              <w:t>DOE / approved runtime</w:t>
             </w:r>
           </w:p>
         </w:tc>
@@ -1117,7 +523,7 @@
                 <w:rFonts w:ascii="Arial" w:hAnsi="Arial"/>
                 <w:sz w:val="18"/>
               </w:rPr>
-              <w:t>Raw source bundles, approved logs/core/NMR, source calculations, target mapping, model training, validation, and runtime outputs.</w:t>
+              <w:t>Approved well logs, workbook rows, core, NMR, label mapping, source rebuilds, training, validation, runtime outputs, and fitted model objects.</w:t>
             </w:r>
           </w:p>
         </w:tc>
@@ -1131,7 +537,7 @@
                 <w:rFonts w:ascii="Arial" w:hAnsi="Arial"/>
                 <w:sz w:val="18"/>
               </w:rPr>
-              <w:t>Public release without review and public-safe reduction.</w:t>
+              <w:t>Public release without review and row-free reduction.</w:t>
             </w:r>
           </w:p>
         </w:tc>
@@ -1140,17 +546,7 @@
     <w:p/>
     <w:p>
       <w:r>
-        <w:t>The deliverable language should make this boundary visible. The public side is</w:t>
-      </w:r>
-    </w:p>
-    <w:p>
-      <w:r>
-        <w:t>where the method and status are explained. The runtime side is where the final</w:t>
-      </w:r>
-    </w:p>
-    <w:p>
-      <w:r>
-        <w:t>approved-data execution happens.</w:t>
+        <w:t>The public side should be treated as a method and provenance surface. The approved runtime is where final data handling, target mapping, and model validation happen.</w:t>
       </w:r>
     </w:p>
     <w:p>
@@ -1158,12 +554,17 @@
         <w:pStyle w:val="Heading1"/>
       </w:pPr>
       <w:r>
-        <w:t>Detailed Forward ML Pipeline</w:t>
+        <w:t>Source-Backed Stability Screen And Guardrails</w:t>
       </w:r>
     </w:p>
     <w:p>
       <w:r>
-        <w:t>The recommended baseline architecture is:</w:t>
+        <w:t>The current stability screen is a source-backed admissibility layer. It uses public well coordinates and depth fields, GGD223 permafrost controls, G10015 temperature-profile context, a hydrostatic pressure assumption, and a digitized USGS SIR 2008 methane hydrate phase boundary for 100 percent methane and 5 ppt salinity.</w:t>
+      </w:r>
+    </w:p>
+    <w:p>
+      <w:r>
+        <w:t>The screen answers one limited question:</w:t>
       </w:r>
     </w:p>
     <w:p>
@@ -1173,195 +574,16 @@
           <w:rFonts w:ascii="Consolas" w:hAnsi="Consolas"/>
           <w:sz w:val="18"/>
         </w:rPr>
-        <w:t>approved LAS/CSV/core/NMR inputs</w:t>
+        <w:t>Under the selected public pressure, temperature, methane, and salinity</w:t>
         <w:br/>
-        <w:t>-&gt; preserve raw headers, mnemonics, units, and source roles</w:t>
+        <w:t>assumptions, does the modeled depth interval intersect methane hydrate</w:t>
         <w:br/>
-        <w:t>-&gt; map aliases to canonical fields</w:t>
-        <w:br/>
-        <w:t>-&gt; convert units while retaining originals</w:t>
-        <w:br/>
-        <w:t>-&gt; align logs, core, NMR, and labels by depth</w:t>
-        <w:br/>
-        <w:t>-&gt; run QC and missingness review</w:t>
-        <w:br/>
-        <w:t>-&gt; compute physics-derived features</w:t>
-        <w:br/>
-        <w:t>-&gt; add stability and reservoir context</w:t>
-        <w:br/>
-        <w:t>-&gt; build target registry and leakage barrier</w:t>
-        <w:br/>
-        <w:t>-&gt; split by complete wells or compartments</w:t>
-        <w:br/>
-        <w:t>-&gt; fit train-only preprocessing</w:t>
-        <w:br/>
-        <w:t>-&gt; train occurrence classifier</w:t>
-        <w:br/>
-        <w:t>-&gt; train saturation regressor</w:t>
-        <w:br/>
-        <w:t>-&gt; export probability, saturation, uncertainty, QC, mimic, and review flags</w:t>
-      </w:r>
-    </w:p>
-    <w:p>
-      <w:pPr>
-        <w:pStyle w:val="Heading2"/>
-      </w:pPr>
-      <w:r>
-        <w:t>Step 1: Approved Inputs And Header Preservation</w:t>
+        <w:t>stability conditions?</w:t>
       </w:r>
     </w:p>
     <w:p>
       <w:r>
-        <w:t>The starting point is not a clean ML table. The approved environment will</w:t>
-      </w:r>
-    </w:p>
-    <w:p>
-      <w:r>
-        <w:t>contain LAS, CSV, workbook, NMR, and core-related inputs with mixed headers,</w:t>
-      </w:r>
-    </w:p>
-    <w:p>
-      <w:r>
-        <w:t>units, mnemonics, and sampling depths. The runtime must first preserve the raw</w:t>
-      </w:r>
-    </w:p>
-    <w:p>
-      <w:r>
-        <w:t>field name, source unit, source mnemonic, schema role, and source file before</w:t>
-      </w:r>
-    </w:p>
-    <w:p>
-      <w:r>
-        <w:t>any conversion.</w:t>
-      </w:r>
-    </w:p>
-    <w:p>
-      <w:r>
-        <w:t>This matters because fields that look similar can have different roles. For</w:t>
-      </w:r>
-    </w:p>
-    <w:p>
-      <w:r>
-        <w:t>example, `NMRPHI` may be a measured porosity input, while `NMR_SAT`, `Sgh`, or</w:t>
-      </w:r>
-    </w:p>
-    <w:p>
-      <w:r>
-        <w:t>`S_h` may be target or calibration fields. The pipeline must fail closed: if a</w:t>
-      </w:r>
-    </w:p>
-    <w:p>
-      <w:r>
-        <w:t>field might be target-derived, it is excluded from predictors until provenance</w:t>
-      </w:r>
-    </w:p>
-    <w:p>
-      <w:r>
-        <w:t>is confirmed.</w:t>
-      </w:r>
-    </w:p>
-    <w:p>
-      <w:pPr>
-        <w:pStyle w:val="Heading2"/>
-      </w:pPr>
-      <w:r>
-        <w:t>Step 2: Unit Normalization And Depth Alignment</w:t>
-      </w:r>
-    </w:p>
-    <w:p>
-      <w:r>
-        <w:t>The runtime converts depth, density, velocity, resistivity, porosity, caliper,</w:t>
-      </w:r>
-    </w:p>
-    <w:p>
-      <w:r>
-        <w:t>and derived features into canonical units while retaining original values and</w:t>
-      </w:r>
-    </w:p>
-    <w:p>
-      <w:r>
-        <w:t>units for audit. Depth alignment must keep track of source depth, aligned depth,</w:t>
-      </w:r>
-    </w:p>
-    <w:p>
-      <w:r>
-        <w:t>matching method, and offset.</w:t>
-      </w:r>
-    </w:p>
-    <w:p>
-      <w:r>
-        <w:t>This step prevents false precision. Core, NMR, logs, and interpreted labels do</w:t>
-      </w:r>
-    </w:p>
-    <w:p>
-      <w:r>
-        <w:t>not necessarily sample the same interval thickness. A nearest-depth match is</w:t>
-      </w:r>
-    </w:p>
-    <w:p>
-      <w:r>
-        <w:t>useful only if the offset and matching rule are recorded.</w:t>
-      </w:r>
-    </w:p>
-    <w:p>
-      <w:pPr>
-        <w:pStyle w:val="Heading2"/>
-      </w:pPr>
-      <w:r>
-        <w:t>Step 3: QC, Missingness, And Bad-Hole Review</w:t>
-      </w:r>
-    </w:p>
-    <w:p>
-      <w:r>
-        <w:t>Caliper and differential caliper belong to QC, not hydrate evidence. When bit</w:t>
-      </w:r>
-    </w:p>
-    <w:p>
-      <w:r>
-        <w:t>size and units are confirmed, the runtime can apply source-defined washout</w:t>
-      </w:r>
-    </w:p>
-    <w:p>
-      <w:r>
-        <w:t>rules. Until then, caliper supports relative QC flags and suspicious-curve</w:t>
-      </w:r>
-    </w:p>
-    <w:p>
-      <w:r>
-        <w:t>review.</w:t>
-      </w:r>
-    </w:p>
-    <w:p>
-      <w:r>
-        <w:t>QC outputs should include exclusion flags, downweight flags, missingness flags,</w:t>
-      </w:r>
-    </w:p>
-    <w:p>
-      <w:r>
-        <w:t>and reason notes. The model should not silently delete intervals or treat</w:t>
-      </w:r>
-    </w:p>
-    <w:p>
-      <w:r>
-        <w:t>missing-log imputation as measured data.</w:t>
-      </w:r>
-    </w:p>
-    <w:p>
-      <w:pPr>
-        <w:pStyle w:val="Heading2"/>
-      </w:pPr>
-      <w:r>
-        <w:t>Step 4: Measured Log Feature Block</w:t>
-      </w:r>
-    </w:p>
-    <w:p>
-      <w:r>
-        <w:t>The first predictor block should use measured or supplied logs after unit</w:t>
-      </w:r>
-    </w:p>
-    <w:p>
-      <w:r>
-        <w:t>checks and QC:</w:t>
+        <w:t>Allowed use:</w:t>
       </w:r>
     </w:p>
     <w:p>
@@ -1369,7 +591,7 @@
         <w:pStyle w:val="ListBullet"/>
       </w:pPr>
       <w:r>
-        <w:t>gamma ray `GR`;</w:t>
+        <w:t>context feature, mask, source-control label, or reviewer reason flag;</w:t>
       </w:r>
     </w:p>
     <w:p>
@@ -1377,7 +599,7 @@
         <w:pStyle w:val="ListBullet"/>
       </w:pPr>
       <w:r>
-        <w:t>bulk density `RHOB`;</w:t>
+        <w:t>public explanation of why pressure-temperature logic belongs upstream of ML;</w:t>
       </w:r>
     </w:p>
     <w:p>
@@ -1385,7 +607,12 @@
         <w:pStyle w:val="ListBullet"/>
       </w:pPr>
       <w:r>
-        <w:t>density and neutron porosity;</w:t>
+        <w:t>source-backed caveat layer for later approved-runtime outputs.</w:t>
+      </w:r>
+    </w:p>
+    <w:p>
+      <w:r>
+        <w:t>Not allowed use:</w:t>
       </w:r>
     </w:p>
     <w:p>
@@ -1393,7 +620,7 @@
         <w:pStyle w:val="ListBullet"/>
       </w:pPr>
       <w:r>
-        <w:t>measured NMR porosity where available;</w:t>
+        <w:t>hydrate proof;</w:t>
       </w:r>
     </w:p>
     <w:p>
@@ -1401,7 +628,7 @@
         <w:pStyle w:val="ListBullet"/>
       </w:pPr>
       <w:r>
-        <w:t>deep resistivity `R_t` with source mnemonic retained;</w:t>
+        <w:t>final stability top/base/thickness;</w:t>
       </w:r>
     </w:p>
     <w:p>
@@ -1409,7 +636,7 @@
         <w:pStyle w:val="ListBullet"/>
       </w:pPr>
       <w:r>
-        <w:t>compressional velocity `V_p`;</w:t>
+        <w:t>hydrate occurrence label;</w:t>
       </w:r>
     </w:p>
     <w:p>
@@ -1417,7 +644,7 @@
         <w:pStyle w:val="ListBullet"/>
       </w:pPr>
       <w:r>
-        <w:t>shear velocity `V_s`;</w:t>
+        <w:t>hydrate saturation estimate;</w:t>
       </w:r>
     </w:p>
     <w:p>
@@ -1425,149 +652,33 @@
         <w:pStyle w:val="ListBullet"/>
       </w:pPr>
       <w:r>
-        <w:t>depth and approved context fields.</w:t>
+        <w:t>sweet-spot ranking;</w:t>
+      </w:r>
+    </w:p>
+    <w:p>
+      <w:pPr>
+        <w:pStyle w:val="ListBullet"/>
+      </w:pPr>
+      <w:r>
+        <w:t>no-hydrate label for blocked rows.</w:t>
       </w:r>
     </w:p>
     <w:p>
       <w:r>
-        <w:t>These features are interpretable and match the direct and comparative hydrate</w:t>
+        <w:t>Blocked means the calculation refused to claim a result because a source or calculation gate did not pass. It does not mean no hydrate.</w:t>
+      </w:r>
+    </w:p>
+    <w:p>
+      <w:pPr>
+        <w:pStyle w:val="Heading1"/>
+      </w:pPr>
+      <w:r>
+        <w:t>Three-Dataset DOE Prototype</w:t>
       </w:r>
     </w:p>
     <w:p>
       <w:r>
-        <w:t>ML literature. They are still non-unique: high resistivity, low gamma ray, or</w:t>
-      </w:r>
-    </w:p>
-    <w:p>
-      <w:r>
-        <w:t>high velocity cannot prove hydrate by themselves.</w:t>
-      </w:r>
-    </w:p>
-    <w:p>
-      <w:pPr>
-        <w:pStyle w:val="Heading2"/>
-      </w:pPr>
-      <w:r>
-        <w:t>Step 5: Physics-Derived Feature Block</w:t>
-      </w:r>
-    </w:p>
-    <w:p>
-      <w:r>
-        <w:t>After measured logs pass unit and QC checks, the runtime can calculate derived</w:t>
-      </w:r>
-    </w:p>
-    <w:p>
-      <w:r>
-        <w:t>features:</w:t>
-      </w:r>
-    </w:p>
-    <w:p>
-      <w:pPr/>
-      <w:r>
-        <w:rPr>
-          <w:rFonts w:ascii="Consolas" w:hAnsi="Consolas"/>
-          <w:sz w:val="18"/>
-        </w:rPr>
-        <w:t>V_p/V_s</w:t>
-        <w:br/>
-        <w:t>acoustic impedance = rho_b * V_p</w:t>
-        <w:br/>
-        <w:t>G = rho * V_s^2</w:t>
-        <w:br/>
-        <w:t>K = rho * (V_p^2 - 4/3 * V_s^2)</w:t>
-        <w:br/>
-        <w:t>E = 9KG / (3K + G)</w:t>
-        <w:br/>
-        <w:t>nu = (3K - 2G) / (2(3K + G))</w:t>
-        <w:br/>
-        <w:t>lambda = K - 2/3G</w:t>
-        <w:br/>
-        <w:t>mu = G</w:t>
-        <w:br/>
-        <w:t>lambda-rho = lambda * rho</w:t>
-        <w:br/>
-        <w:t>mu-rho = mu * rho</w:t>
-      </w:r>
-    </w:p>
-    <w:p>
-      <w:r>
-        <w:t>These features matter because pore-filling hydrate can stiffen the sediment</w:t>
-      </w:r>
-    </w:p>
-    <w:p>
-      <w:r>
-        <w:t>frame. Resistivity can be high for hydrate, free gas, ice, tight rock, cement,</w:t>
-      </w:r>
-    </w:p>
-    <w:p>
-      <w:r>
-        <w:t>or salinity effects, so elastic features such as `V_s`, shear modulus, and</w:t>
-      </w:r>
-    </w:p>
-    <w:p>
-      <w:r>
-        <w:t>`mu-rho` help separate hydrate-like stiffness from resistivity-only mimics.</w:t>
-      </w:r>
-    </w:p>
-    <w:p>
-      <w:r>
-        <w:t>Derived features inherit every error from the source curves. If density,</w:t>
-      </w:r>
-    </w:p>
-    <w:p>
-      <w:r>
-        <w:t>`V_p`, or `V_s` fails QC, the derived features must be flagged or withheld.</w:t>
-      </w:r>
-    </w:p>
-    <w:p>
-      <w:pPr>
-        <w:pStyle w:val="Heading2"/>
-      </w:pPr>
-      <w:r>
-        <w:t>Step 6: Stability And Reservoir Context</w:t>
-      </w:r>
-    </w:p>
-    <w:p>
-      <w:r>
-        <w:t>The public stability screen becomes a context layer for the approved runtime.</w:t>
-      </w:r>
-    </w:p>
-    <w:p>
-      <w:r>
-        <w:t>It can become a feature, mask, reason flag, or interpretation context, but it</w:t>
-      </w:r>
-    </w:p>
-    <w:p>
-      <w:r>
-        <w:t>does not become a hydrate label.</w:t>
-      </w:r>
-    </w:p>
-    <w:p>
-      <w:r>
-        <w:t>Reservoir context works the same way. Clean sand, low shale response, porosity,</w:t>
-      </w:r>
-    </w:p>
-    <w:p>
-      <w:r>
-        <w:t>and reservoir-quality core can support the target interpretation, but a clean</w:t>
-      </w:r>
-    </w:p>
-    <w:p>
-      <w:r>
-        <w:t>sand inside the stability window still is not automatically hydrate-bearing.</w:t>
-      </w:r>
-    </w:p>
-    <w:p>
-      <w:pPr>
-        <w:pStyle w:val="Heading2"/>
-      </w:pPr>
-      <w:r>
-        <w:t>Step 7: Target Registry And Leakage Barrier</w:t>
-      </w:r>
-    </w:p>
-    <w:p>
-      <w:r>
-        <w:t>Before modeling, every possible answer column must be classified:</w:t>
+        <w:t>The DOE prototype is the first approved-runtime plumbing test. It is designed around three available workbooks:</w:t>
       </w:r>
     </w:p>
     <w:tbl>
@@ -1593,7 +704,7 @@
                 <w:b/>
                 <w:sz w:val="18"/>
               </w:rPr>
-              <w:t>Field family</w:t>
+              <w:t>Dataset</w:t>
             </w:r>
           </w:p>
         </w:tc>
@@ -1608,7 +719,7 @@
                 <w:b/>
                 <w:sz w:val="18"/>
               </w:rPr>
-              <w:t>Role</w:t>
+              <w:t>Prototype role</w:t>
             </w:r>
           </w:p>
         </w:tc>
@@ -1623,7 +734,7 @@
                 <w:b/>
                 <w:sz w:val="18"/>
               </w:rPr>
-              <w:t>Predictor status</w:t>
+              <w:t>Current use</w:t>
             </w:r>
           </w:p>
         </w:tc>
@@ -1639,7 +750,7 @@
                 <w:rFonts w:ascii="Arial" w:hAnsi="Arial"/>
                 <w:sz w:val="18"/>
               </w:rPr>
-              <w:t>`S_h`, `Sgh`, hydrate saturation</w:t>
+              <w:t>curated_dataset1.xlsx</w:t>
             </w:r>
           </w:p>
         </w:tc>
@@ -1653,7 +764,7 @@
                 <w:rFonts w:ascii="Arial" w:hAnsi="Arial"/>
                 <w:sz w:val="18"/>
               </w:rPr>
-              <w:t>Regression target or calibration target.</w:t>
+              <w:t>Training-style workbook</w:t>
             </w:r>
           </w:p>
         </w:tc>
@@ -1667,7 +778,7 @@
                 <w:rFonts w:ascii="Arial" w:hAnsi="Arial"/>
                 <w:sz w:val="18"/>
               </w:rPr>
-              <w:t>Excluded from predictors.</w:t>
+              <w:t>Used to detect target variants and train small prototype regressors when usable targets exist.</w:t>
             </w:r>
           </w:p>
         </w:tc>
@@ -1683,7 +794,7 @@
                 <w:rFonts w:ascii="Arial" w:hAnsi="Arial"/>
                 <w:sz w:val="18"/>
               </w:rPr>
-              <w:t>`NMR_SAT` or NMR-derived saturation</w:t>
+              <w:t>curated_dataset2.xlsx</w:t>
             </w:r>
           </w:p>
         </w:tc>
@@ -1697,7 +808,7 @@
                 <w:rFonts w:ascii="Arial" w:hAnsi="Arial"/>
                 <w:sz w:val="18"/>
               </w:rPr>
-              <w:t>Target or calibration reference unless proven to be measured porosity.</w:t>
+              <w:t>External/test-style workbook</w:t>
             </w:r>
           </w:p>
         </w:tc>
@@ -1711,7 +822,7 @@
                 <w:rFonts w:ascii="Arial" w:hAnsi="Arial"/>
                 <w:sz w:val="18"/>
               </w:rPr>
-              <w:t>Excluded from predictors.</w:t>
+              <w:t>Scored or inventoried separately, depending on target and feature availability.</w:t>
             </w:r>
           </w:p>
         </w:tc>
@@ -1727,7 +838,7 @@
                 <w:rFonts w:ascii="Arial" w:hAnsi="Arial"/>
                 <w:sz w:val="18"/>
               </w:rPr>
-              <w:t>Phase or occurrence label</w:t>
+              <w:t>curated_dataset3.xlsx</w:t>
             </w:r>
           </w:p>
         </w:tc>
@@ -1741,7 +852,7 @@
                 <w:rFonts w:ascii="Arial" w:hAnsi="Arial"/>
                 <w:sz w:val="18"/>
               </w:rPr>
-              <w:t>Classification target.</w:t>
+              <w:t>External/test-style workbook</w:t>
             </w:r>
           </w:p>
         </w:tc>
@@ -1755,95 +866,7 @@
                 <w:rFonts w:ascii="Arial" w:hAnsi="Arial"/>
                 <w:sz w:val="18"/>
               </w:rPr>
-              <w:t>Excluded from predictors.</w:t>
-            </w:r>
-          </w:p>
-        </w:tc>
-      </w:tr>
-      <w:tr>
-        <w:tc>
-          <w:tcPr>
-            <w:tcW w:type="dxa" w:w="3360"/>
-          </w:tcPr>
-          <w:p>
-            <w:r>
-              <w:rPr>
-                <w:rFonts w:ascii="Arial" w:hAnsi="Arial"/>
-                <w:sz w:val="18"/>
-              </w:rPr>
-              <w:t>Core lithology or reservoir label</w:t>
-            </w:r>
-          </w:p>
-        </w:tc>
-        <w:tc>
-          <w:tcPr>
-            <w:tcW w:type="dxa" w:w="3360"/>
-          </w:tcPr>
-          <w:p>
-            <w:r>
-              <w:rPr>
-                <w:rFonts w:ascii="Arial" w:hAnsi="Arial"/>
-                <w:sz w:val="18"/>
-              </w:rPr>
-              <w:t>Calibration, validation, or independent context depending on source.</w:t>
-            </w:r>
-          </w:p>
-        </w:tc>
-        <w:tc>
-          <w:tcPr>
-            <w:tcW w:type="dxa" w:w="3360"/>
-          </w:tcPr>
-          <w:p>
-            <w:r>
-              <w:rPr>
-                <w:rFonts w:ascii="Arial" w:hAnsi="Arial"/>
-                <w:sz w:val="18"/>
-              </w:rPr>
-              <w:t>Allowed only if independent of target interpretation.</w:t>
-            </w:r>
-          </w:p>
-        </w:tc>
-      </w:tr>
-      <w:tr>
-        <w:tc>
-          <w:tcPr>
-            <w:tcW w:type="dxa" w:w="3360"/>
-          </w:tcPr>
-          <w:p>
-            <w:r>
-              <w:rPr>
-                <w:rFonts w:ascii="Arial" w:hAnsi="Arial"/>
-                <w:sz w:val="18"/>
-              </w:rPr>
-              <w:t>Permeability or producibility</w:t>
-            </w:r>
-          </w:p>
-        </w:tc>
-        <w:tc>
-          <w:tcPr>
-            <w:tcW w:type="dxa" w:w="3360"/>
-          </w:tcPr>
-          <w:p>
-            <w:r>
-              <w:rPr>
-                <w:rFonts w:ascii="Arial" w:hAnsi="Arial"/>
-                <w:sz w:val="18"/>
-              </w:rPr>
-              <w:t>Separate downstream output.</w:t>
-            </w:r>
-          </w:p>
-        </w:tc>
-        <w:tc>
-          <w:tcPr>
-            <w:tcW w:type="dxa" w:w="3360"/>
-          </w:tcPr>
-          <w:p>
-            <w:r>
-              <w:rPr>
-                <w:rFonts w:ascii="Arial" w:hAnsi="Arial"/>
-                <w:sz w:val="18"/>
-              </w:rPr>
-              <w:t>Not an occurrence or saturation label.</w:t>
+              <w:t>Scored or inventoried separately, depending on target and feature availability.</w:t>
             </w:r>
           </w:p>
         </w:tc>
@@ -1852,35 +875,78 @@
     <w:p/>
     <w:p>
       <w:r>
-        <w:t>This is the leakage barrier. It prevents the model from learning the answer</w:t>
+        <w:t>The prototype can scan sheets, identify target-looking saturation columns, train separate target runs for visible variants such as `S_h`, `S_wr`, `Sh`, or `Swr`, and write row-free run summaries for the website tracker.</w:t>
       </w:r>
     </w:p>
     <w:p>
       <w:r>
-        <w:t>column or using a field derived from the answer as if it were an independent</w:t>
+        <w:t>The important result is the audit trail:</w:t>
+      </w:r>
+    </w:p>
+    <w:p>
+      <w:pPr>
+        <w:pStyle w:val="ListBullet"/>
+      </w:pPr>
+      <w:r>
+        <w:t>saturation-like columns are treated as Y-only unless proven otherwise;</w:t>
+      </w:r>
+    </w:p>
+    <w:p>
+      <w:pPr>
+        <w:pStyle w:val="ListBullet"/>
+      </w:pPr>
+      <w:r>
+        <w:t>depth is treated as alignment/context rather than a default predictor;</w:t>
+      </w:r>
+    </w:p>
+    <w:p>
+      <w:pPr>
+        <w:pStyle w:val="ListBullet"/>
+      </w:pPr>
+      <w:r>
+        <w:t>spreadsheet helper columns and duplicate raw aliases are excluded;</w:t>
+      </w:r>
+    </w:p>
+    <w:p>
+      <w:pPr>
+        <w:pStyle w:val="ListBullet"/>
+      </w:pPr>
+      <w:r>
+        <w:t>feature families are recorded target by target;</w:t>
+      </w:r>
+    </w:p>
+    <w:p>
+      <w:pPr>
+        <w:pStyle w:val="ListBullet"/>
+      </w:pPr>
+      <w:r>
+        <w:t>exclusions carry reasons rather than disappearing silently;</w:t>
+      </w:r>
+    </w:p>
+    <w:p>
+      <w:pPr>
+        <w:pStyle w:val="ListBullet"/>
+      </w:pPr>
+      <w:r>
+        <w:t>validation status is separated from training-fit metrics.</w:t>
       </w:r>
     </w:p>
     <w:p>
       <w:r>
-        <w:t>predictor.</w:t>
+        <w:t>Any training-fit R2 from this prototype is a runtime check only. It is not final validated North Slope performance.</w:t>
       </w:r>
     </w:p>
     <w:p>
       <w:pPr>
-        <w:pStyle w:val="Heading2"/>
+        <w:pStyle w:val="Heading1"/>
       </w:pPr>
       <w:r>
-        <w:t>Step 8: Model Ladder</w:t>
+        <w:t>Cleaned Feature Matrix And Leakage Prevention</w:t>
       </w:r>
     </w:p>
     <w:p>
       <w:r>
-        <w:t>The first implementation should be baseline-first. Advanced models become</w:t>
-      </w:r>
-    </w:p>
-    <w:p>
-      <w:r>
-        <w:t>defensible only after inputs, targets, QC, and splits are controlled.</w:t>
+        <w:t>The cleaned feature matrix is the main technical contribution that can be reviewed now. It makes the future ML workflow defensible before the final model exists.</w:t>
       </w:r>
     </w:p>
     <w:tbl>
@@ -1906,7 +972,7 @@
                 <w:b/>
                 <w:sz w:val="18"/>
               </w:rPr>
-              <w:t>Model stage</w:t>
+              <w:t>Control</w:t>
             </w:r>
           </w:p>
         </w:tc>
@@ -1921,7 +987,7 @@
                 <w:b/>
                 <w:sz w:val="18"/>
               </w:rPr>
-              <w:t>Purpose</w:t>
+              <w:t>What it does</w:t>
             </w:r>
           </w:p>
         </w:tc>
@@ -1936,7 +1002,7 @@
                 <w:b/>
                 <w:sz w:val="18"/>
               </w:rPr>
-              <w:t>Why it belongs</w:t>
+              <w:t>Why it matters</w:t>
             </w:r>
           </w:p>
         </w:tc>
@@ -1952,7 +1018,7 @@
                 <w:rFonts w:ascii="Arial" w:hAnsi="Arial"/>
                 <w:sz w:val="18"/>
               </w:rPr>
-              <w:t>Physics/rule baseline</w:t>
+              <w:t>Original header preservation</w:t>
             </w:r>
           </w:p>
         </w:tc>
@@ -1966,7 +1032,7 @@
                 <w:rFonts w:ascii="Arial" w:hAnsi="Arial"/>
                 <w:sz w:val="18"/>
               </w:rPr>
-              <w:t>Transparent benchmark using stability, reservoir, resistivity, acoustic, and Archie-style logic.</w:t>
+              <w:t>Keeps source header, unit, and role visible before normalization.</w:t>
             </w:r>
           </w:p>
         </w:tc>
@@ -1980,7 +1046,7 @@
                 <w:rFonts w:ascii="Arial" w:hAnsi="Arial"/>
                 <w:sz w:val="18"/>
               </w:rPr>
-              <w:t>Catches feature mistakes and gives a scientific comparison.</w:t>
+              <w:t>Prevents silent unit mistakes and makes workbook review possible.</w:t>
             </w:r>
           </w:p>
         </w:tc>
@@ -1996,7 +1062,7 @@
                 <w:rFonts w:ascii="Arial" w:hAnsi="Arial"/>
                 <w:sz w:val="18"/>
               </w:rPr>
-              <w:t>Simple supervised baseline</w:t>
+              <w:t>`X_allowed` contract</w:t>
             </w:r>
           </w:p>
         </w:tc>
@@ -2010,7 +1076,7 @@
                 <w:rFonts w:ascii="Arial" w:hAnsi="Arial"/>
                 <w:sz w:val="18"/>
               </w:rPr>
-              <w:t>Logistic/linear/SGD style check.</w:t>
+              <w:t>Allows only measured logs, approved derived physics, QC/context flags, and non-leaking metadata.</w:t>
             </w:r>
           </w:p>
         </w:tc>
@@ -2024,7 +1090,7 @@
                 <w:rFonts w:ascii="Arial" w:hAnsi="Arial"/>
                 <w:sz w:val="18"/>
               </w:rPr>
-              <w:t>Easy to explain and useful for leakage detection.</w:t>
+              <w:t>Stops answer-like columns from entering predictors.</w:t>
             </w:r>
           </w:p>
         </w:tc>
@@ -2040,7 +1106,7 @@
                 <w:rFonts w:ascii="Arial" w:hAnsi="Arial"/>
                 <w:sz w:val="18"/>
               </w:rPr>
-              <w:t>Tree-based model</w:t>
+              <w:t>Y-only registry</w:t>
             </w:r>
           </w:p>
         </w:tc>
@@ -2054,7 +1120,7 @@
                 <w:rFonts w:ascii="Arial" w:hAnsi="Arial"/>
                 <w:sz w:val="18"/>
               </w:rPr>
-              <w:t>Random forest or gradient boosting for tabular log interactions.</w:t>
+              <w:t>Routes `S_h`, `Sgh`, `Sh`, `NMR_SAT`, `Swr`, `S_wr`, hydrate saturation, and phase labels outside predictors.</w:t>
             </w:r>
           </w:p>
         </w:tc>
@@ -2068,7 +1134,7 @@
                 <w:rFonts w:ascii="Arial" w:hAnsi="Arial"/>
                 <w:sz w:val="18"/>
               </w:rPr>
-              <w:t>Handles nonlinear feature combinations and gives diagnostic importance patterns.</w:t>
+              <w:t>Prevents target leakage and false model skill.</w:t>
             </w:r>
           </w:p>
         </w:tc>
@@ -2084,7 +1150,7 @@
                 <w:rFonts w:ascii="Arial" w:hAnsi="Arial"/>
                 <w:sz w:val="18"/>
               </w:rPr>
-              <w:t>ANN/MLP</w:t>
+              <w:t>Helper-column exclusion</w:t>
             </w:r>
           </w:p>
         </w:tc>
@@ -2098,7 +1164,7 @@
                 <w:rFonts w:ascii="Arial" w:hAnsi="Arial"/>
                 <w:sz w:val="18"/>
               </w:rPr>
-              <w:t>Directly matches the main hydrate ML analogue.</w:t>
+              <w:t>Removes unnamed spreadsheet artifacts, duplicated raw aliases, unit helper columns, and depth fields when they are not approved predictors.</w:t>
             </w:r>
           </w:p>
         </w:tc>
@@ -2112,7 +1178,7 @@
                 <w:rFonts w:ascii="Arial" w:hAnsi="Arial"/>
                 <w:sz w:val="18"/>
               </w:rPr>
-              <w:t>Can learn nonlinear saturation response when enough labeled wells exist.</w:t>
+              <w:t>Reduces accidental leakage and spreadsheet noise.</w:t>
             </w:r>
           </w:p>
         </w:tc>
@@ -2128,7 +1194,7 @@
                 <w:rFonts w:ascii="Arial" w:hAnsi="Arial"/>
                 <w:sz w:val="18"/>
               </w:rPr>
-              <w:t>Optional sequence model</w:t>
+              <w:t>Train-only preprocessing</w:t>
             </w:r>
           </w:p>
         </w:tc>
@@ -2142,7 +1208,7 @@
                 <w:rFonts w:ascii="Arial" w:hAnsi="Arial"/>
                 <w:sz w:val="18"/>
               </w:rPr>
-              <w:t>LSTM or depth-sequence model only if continuous depth sequences and grouped validation support it.</w:t>
+              <w:t>Fits scaling, imputation, and feature selection only after the split.</w:t>
             </w:r>
           </w:p>
         </w:tc>
@@ -2156,51 +1222,7 @@
                 <w:rFonts w:ascii="Arial" w:hAnsi="Arial"/>
                 <w:sz w:val="18"/>
               </w:rPr>
-              <w:t>Uses vertical pattern, but has high leakage risk.</w:t>
-            </w:r>
-          </w:p>
-        </w:tc>
-      </w:tr>
-      <w:tr>
-        <w:tc>
-          <w:tcPr>
-            <w:tcW w:type="dxa" w:w="3360"/>
-          </w:tcPr>
-          <w:p>
-            <w:r>
-              <w:rPr>
-                <w:rFonts w:ascii="Arial" w:hAnsi="Arial"/>
-                <w:sz w:val="18"/>
-              </w:rPr>
-              <w:t>Optional missing-log adapter</w:t>
-            </w:r>
-          </w:p>
-        </w:tc>
-        <w:tc>
-          <w:tcPr>
-            <w:tcW w:type="dxa" w:w="3360"/>
-          </w:tcPr>
-          <w:p>
-            <w:r>
-              <w:rPr>
-                <w:rFonts w:ascii="Arial" w:hAnsi="Arial"/>
-                <w:sz w:val="18"/>
-              </w:rPr>
-              <w:t>Predicts missing `V_p`, `RHOB`, or other curves only as a provenance-flagged support layer.</w:t>
-            </w:r>
-          </w:p>
-        </w:tc>
-        <w:tc>
-          <w:tcPr>
-            <w:tcW w:type="dxa" w:w="3360"/>
-          </w:tcPr>
-          <w:p>
-            <w:r>
-              <w:rPr>
-                <w:rFonts w:ascii="Arial" w:hAnsi="Arial"/>
-                <w:sz w:val="18"/>
-              </w:rPr>
-              <w:t>Expands feature coverage but must not be treated as measured data.</w:t>
+              <w:t>Keeps validation honest when final grouped splits are used.</w:t>
             </w:r>
           </w:p>
         </w:tc>
@@ -2209,64 +1231,20 @@
     <w:p/>
     <w:p>
       <w:r>
-        <w:t>The recommended final shape is two linked outputs:</w:t>
+        <w:t>The current matrix can support a mentor conversation about what fields belong in `X_allowed`, what fields are targets, and what still needs source review.</w:t>
       </w:r>
     </w:p>
     <w:p>
-      <w:pPr/>
+      <w:pPr>
+        <w:pStyle w:val="Heading1"/>
+      </w:pPr>
       <w:r>
-        <w:rPr>
-          <w:rFonts w:ascii="Consolas" w:hAnsi="Consolas"/>
-          <w:sz w:val="18"/>
-        </w:rPr>
-        <w:t>occurrence classifier</w:t>
-        <w:br/>
-        <w:t>+ saturation regressor</w:t>
-        <w:br/>
-        <w:t>+ uncertainty / QC / reason flags</w:t>
+        <w:t>How Stability Connects To ML Later</w:t>
       </w:r>
     </w:p>
     <w:p>
       <w:r>
-        <w:t>Occurrence and saturation should stay separate. A model can predict that an</w:t>
-      </w:r>
-    </w:p>
-    <w:p>
-      <w:r>
-        <w:t>interval is likely hydrate-bearing, and a second model can estimate saturation</w:t>
-      </w:r>
-    </w:p>
-    <w:p>
-      <w:r>
-        <w:t>where the occurrence/context logic supports that interpretation.</w:t>
-      </w:r>
-    </w:p>
-    <w:p>
-      <w:pPr>
-        <w:pStyle w:val="Heading2"/>
-      </w:pPr>
-      <w:r>
-        <w:t>Step 9: Validation</w:t>
-      </w:r>
-    </w:p>
-    <w:p>
-      <w:r>
-        <w:t>Final validation should use complete-well or compartment holdouts, not random</w:t>
-      </w:r>
-    </w:p>
-    <w:p>
-      <w:r>
-        <w:t>depth rows as final evidence. Depth rows from one well are correlated. Random</w:t>
-      </w:r>
-    </w:p>
-    <w:p>
-      <w:r>
-        <w:t>row splits can make the model look better than it will be on new wells.</w:t>
-      </w:r>
-    </w:p>
-    <w:p>
-      <w:r>
-        <w:t>Validation must:</w:t>
+        <w:t>Stability should connect to ML as context, not as a label. In the approved runtime, stability can be joined to model rows as:</w:t>
       </w:r>
     </w:p>
     <w:p>
@@ -2274,7 +1252,7 @@
         <w:pStyle w:val="ListBullet"/>
       </w:pPr>
       <w:r>
-        <w:t>split wells before fitting scalers, imputers, feature selectors, or models;</w:t>
+        <w:t>`stability_status`;</w:t>
       </w:r>
     </w:p>
     <w:p>
@@ -2282,7 +1260,7 @@
         <w:pStyle w:val="ListBullet"/>
       </w:pPr>
       <w:r>
-        <w:t>fit preprocessing on training wells only;</w:t>
+        <w:t>`stability_confidence`;</w:t>
       </w:r>
     </w:p>
     <w:p>
@@ -2290,7 +1268,7 @@
         <w:pStyle w:val="ListBullet"/>
       </w:pPr>
       <w:r>
-        <w:t>report occurrence and saturation performance separately;</w:t>
+        <w:t>caveat codes;</w:t>
       </w:r>
     </w:p>
     <w:p>
@@ -2298,12 +1276,7 @@
         <w:pStyle w:val="ListBullet"/>
       </w:pPr>
       <w:r>
-        <w:t>compare known-well outputs against NMR, core, interpreted saturation, and</w:t>
-      </w:r>
-    </w:p>
-    <w:p>
-      <w:r>
-        <w:t>phase labels where approved;</w:t>
+        <w:t>inside/outside/blocked context;</w:t>
       </w:r>
     </w:p>
     <w:p>
@@ -2311,12 +1284,7 @@
         <w:pStyle w:val="ListBullet"/>
       </w:pPr>
       <w:r>
-        <w:t>review residuals by well, depth, reservoir class, QC status, and missing-log</w:t>
-      </w:r>
-    </w:p>
-    <w:p>
-      <w:r>
-        <w:t>route;</w:t>
+        <w:t>reason flags for reviewer plots;</w:t>
       </w:r>
     </w:p>
     <w:p>
@@ -2324,20 +1292,197 @@
         <w:pStyle w:val="ListBullet"/>
       </w:pPr>
       <w:r>
-        <w:t>flag out-of-distribution intervals and generated-feature routes.</w:t>
+        <w:t>optional mask only if the mentor approves that policy.</w:t>
+      </w:r>
+    </w:p>
+    <w:p>
+      <w:r>
+        <w:t>The occurrence classifier and saturation regressor must still learn from approved labels and validated well-log/core/NMR evidence. Stability can explain whether a prediction is physically admissible under the current assumptions, but it cannot create occurrence or saturation by itself.</w:t>
       </w:r>
     </w:p>
     <w:p>
       <w:pPr>
-        <w:pStyle w:val="Heading2"/>
+        <w:pStyle w:val="Heading1"/>
       </w:pPr>
       <w:r>
-        <w:t>Step 10: Outputs</w:t>
+        <w:t>What The Three Datasets Can Support Now</w:t>
       </w:r>
     </w:p>
     <w:p>
       <w:r>
-        <w:t>The final approved-environment workflow should export:</w:t>
+        <w:t>The current three-dataset package can support:</w:t>
+      </w:r>
+    </w:p>
+    <w:p>
+      <w:pPr>
+        <w:pStyle w:val="ListBullet"/>
+      </w:pPr>
+      <w:r>
+        <w:t>workbook and sheet inventory;</w:t>
+      </w:r>
+    </w:p>
+    <w:p>
+      <w:pPr>
+        <w:pStyle w:val="ListBullet"/>
+      </w:pPr>
+      <w:r>
+        <w:t>target-variant discovery;</w:t>
+      </w:r>
+    </w:p>
+    <w:p>
+      <w:pPr>
+        <w:pStyle w:val="ListBullet"/>
+      </w:pPr>
+      <w:r>
+        <w:t>schema and feature-family audit;</w:t>
+      </w:r>
+    </w:p>
+    <w:p>
+      <w:pPr>
+        <w:pStyle w:val="ListBullet"/>
+      </w:pPr>
+      <w:r>
+        <w:t>cleaned feature matrix construction;</w:t>
+      </w:r>
+    </w:p>
+    <w:p>
+      <w:pPr>
+        <w:pStyle w:val="ListBullet"/>
+      </w:pPr>
+      <w:r>
+        <w:t>target-leakage testing;</w:t>
+      </w:r>
+    </w:p>
+    <w:p>
+      <w:pPr>
+        <w:pStyle w:val="ListBullet"/>
+      </w:pPr>
+      <w:r>
+        <w:t>train-only preprocessing proof;</w:t>
+      </w:r>
+    </w:p>
+    <w:p>
+      <w:pPr>
+        <w:pStyle w:val="ListBullet"/>
+      </w:pPr>
+      <w:r>
+        <w:t>row-free model-run tracker summaries;</w:t>
+      </w:r>
+    </w:p>
+    <w:p>
+      <w:pPr>
+        <w:pStyle w:val="ListBullet"/>
+      </w:pPr>
+      <w:r>
+        <w:t>mentor review of exclusions, labels, and blockers.</w:t>
+      </w:r>
+    </w:p>
+    <w:p>
+      <w:r>
+        <w:t>It cannot yet support final claims about hydrate occurrence, hydrate saturation, producibility, regional sweet spots, or validated model performance.</w:t>
+      </w:r>
+    </w:p>
+    <w:p>
+      <w:pPr>
+        <w:pStyle w:val="Heading1"/>
+      </w:pPr>
+      <w:r>
+        <w:t>What Cannot Be Claimed Yet</w:t>
+      </w:r>
+    </w:p>
+    <w:p>
+      <w:r>
+        <w:t>The project should not claim:</w:t>
+      </w:r>
+    </w:p>
+    <w:p>
+      <w:pPr>
+        <w:pStyle w:val="ListBullet"/>
+      </w:pPr>
+      <w:r>
+        <w:t>hydrate proof;</w:t>
+      </w:r>
+    </w:p>
+    <w:p>
+      <w:pPr>
+        <w:pStyle w:val="ListBullet"/>
+      </w:pPr>
+      <w:r>
+        <w:t>final stability boundaries or thickness;</w:t>
+      </w:r>
+    </w:p>
+    <w:p>
+      <w:pPr>
+        <w:pStyle w:val="ListBullet"/>
+      </w:pPr>
+      <w:r>
+        <w:t>occurrence predictions;</w:t>
+      </w:r>
+    </w:p>
+    <w:p>
+      <w:pPr>
+        <w:pStyle w:val="ListBullet"/>
+      </w:pPr>
+      <w:r>
+        <w:t>saturation predictions;</w:t>
+      </w:r>
+    </w:p>
+    <w:p>
+      <w:pPr>
+        <w:pStyle w:val="ListBullet"/>
+      </w:pPr>
+      <w:r>
+        <w:t>validated occurrence or saturation model metrics;</w:t>
+      </w:r>
+    </w:p>
+    <w:p>
+      <w:pPr>
+        <w:pStyle w:val="ListBullet"/>
+      </w:pPr>
+      <w:r>
+        <w:t>final target-label authority;</w:t>
+      </w:r>
+    </w:p>
+    <w:p>
+      <w:pPr>
+        <w:pStyle w:val="ListBullet"/>
+      </w:pPr>
+      <w:r>
+        <w:t>public release of row-level approved data;</w:t>
+      </w:r>
+    </w:p>
+    <w:p>
+      <w:pPr>
+        <w:pStyle w:val="ListBullet"/>
+      </w:pPr>
+      <w:r>
+        <w:t>public maps of private predictions;</w:t>
+      </w:r>
+    </w:p>
+    <w:p>
+      <w:pPr>
+        <w:pStyle w:val="ListBullet"/>
+      </w:pPr>
+      <w:r>
+        <w:t>final sweet-spot or producibility ranking.</w:t>
+      </w:r>
+    </w:p>
+    <w:p>
+      <w:r>
+        <w:t>Preferred language is: public-safe scaffold, schema readiness, stability-admissibility, working screening envelope, target-only label, runtime confirmation needed, mentor review needed, and not hydrate proof.</w:t>
+      </w:r>
+    </w:p>
+    <w:p>
+      <w:pPr>
+        <w:pStyle w:val="Heading1"/>
+      </w:pPr>
+      <w:r>
+        <w:t>Packages And Access That Unlock Next</w:t>
+      </w:r>
+    </w:p>
+    <w:p>
+      <w:r>
+        <w:t>The next step depends on DOE package and data access.</w:t>
       </w:r>
     </w:p>
     <w:tbl>
@@ -2363,7 +1508,7 @@
                 <w:b/>
                 <w:sz w:val="18"/>
               </w:rPr>
-              <w:t>Output</w:t>
+              <w:t>Package or access</w:t>
             </w:r>
           </w:p>
         </w:tc>
@@ -2378,7 +1523,7 @@
                 <w:b/>
                 <w:sz w:val="18"/>
               </w:rPr>
-              <w:t>Meaning</w:t>
+              <w:t>What it unlocks</w:t>
             </w:r>
           </w:p>
         </w:tc>
@@ -2393,7 +1538,7 @@
                 <w:b/>
                 <w:sz w:val="18"/>
               </w:rPr>
-              <w:t>Guardrail</w:t>
+              <w:t>Public-safe output after review</w:t>
             </w:r>
           </w:p>
         </w:tc>
@@ -2409,7 +1554,7 @@
                 <w:rFonts w:ascii="Arial" w:hAnsi="Arial"/>
                 <w:sz w:val="18"/>
               </w:rPr>
-              <w:t>Occurrence probability</w:t>
+              <w:t>lasio</w:t>
             </w:r>
           </w:p>
         </w:tc>
@@ -2423,7 +1568,7 @@
                 <w:rFonts w:ascii="Arial" w:hAnsi="Arial"/>
                 <w:sz w:val="18"/>
               </w:rPr>
-              <w:t>Classifier estimate that an interval is hydrate-bearing.</w:t>
+              <w:t>Direct LAS loading instead of workbook-only tables.</w:t>
             </w:r>
           </w:p>
         </w:tc>
@@ -2437,7 +1582,7 @@
                 <w:rFonts w:ascii="Arial" w:hAnsi="Arial"/>
                 <w:sz w:val="18"/>
               </w:rPr>
-              <w:t>Not saturation, proof, or producibility.</w:t>
+              <w:t>Header and curve-coverage summaries.</w:t>
             </w:r>
           </w:p>
         </w:tc>
@@ -2453,7 +1598,7 @@
                 <w:rFonts w:ascii="Arial" w:hAnsi="Arial"/>
                 <w:sz w:val="18"/>
               </w:rPr>
-              <w:t>Saturation estimate</w:t>
+              <w:t>geopandas`, `shapely`, `pyproj`, `fiona`, `pyogrio`, `rtree</w:t>
             </w:r>
           </w:p>
         </w:tc>
@@ -2467,7 +1612,7 @@
                 <w:rFonts w:ascii="Arial" w:hAnsi="Arial"/>
                 <w:sz w:val="18"/>
               </w:rPr>
-              <w:t>Continuous hydrate saturation estimate.</w:t>
+              <w:t>Local spatial joins for stability and map overlays.</w:t>
             </w:r>
           </w:p>
         </w:tc>
@@ -2481,7 +1626,7 @@
                 <w:rFonts w:ascii="Arial" w:hAnsi="Arial"/>
                 <w:sz w:val="18"/>
               </w:rPr>
-              <w:t>Not an occurrence label by itself.</w:t>
+              <w:t>Row-free spatial coverage summaries and public maps.</w:t>
             </w:r>
           </w:p>
         </w:tc>
@@ -2497,7 +1642,7 @@
                 <w:rFonts w:ascii="Arial" w:hAnsi="Arial"/>
                 <w:sz w:val="18"/>
               </w:rPr>
-              <w:t>Uncertainty or confidence</w:t>
+              <w:t>scikit-learn`, `joblib</w:t>
             </w:r>
           </w:p>
         </w:tc>
@@ -2511,7 +1656,7 @@
                 <w:rFonts w:ascii="Arial" w:hAnsi="Arial"/>
                 <w:sz w:val="18"/>
               </w:rPr>
-              <w:t>Model, feature, QC, target, and source-control status.</w:t>
+              <w:t>Baseline models, saved local pipelines, grouped validation.</w:t>
             </w:r>
           </w:p>
         </w:tc>
@@ -2525,7 +1670,7 @@
                 <w:rFonts w:ascii="Arial" w:hAnsi="Arial"/>
                 <w:sz w:val="18"/>
               </w:rPr>
-              <w:t>Not a guarantee.</w:t>
+              <w:t>Public-safe model-run summaries after review.</w:t>
             </w:r>
           </w:p>
         </w:tc>
@@ -2541,7 +1686,7 @@
                 <w:rFonts w:ascii="Arial" w:hAnsi="Arial"/>
                 <w:sz w:val="18"/>
               </w:rPr>
-              <w:t>QC status</w:t>
+              <w:t>plotly`, `streamlit</w:t>
             </w:r>
           </w:p>
         </w:tc>
@@ -2555,7 +1700,7 @@
                 <w:rFonts w:ascii="Arial" w:hAnsi="Arial"/>
                 <w:sz w:val="18"/>
               </w:rPr>
-              <w:t>Bad-hole, missingness, depth, and outlier review.</w:t>
+              <w:t>DOE-local review website with tracker, maps, and well plots.</w:t>
             </w:r>
           </w:p>
         </w:tc>
@@ -2569,7 +1714,7 @@
                 <w:rFonts w:ascii="Arial" w:hAnsi="Arial"/>
                 <w:sz w:val="18"/>
               </w:rPr>
-              <w:t>Not hydrate evidence.</w:t>
+              <w:t>Screenshots or summaries only after row/privacy review.</w:t>
             </w:r>
           </w:p>
         </w:tc>
@@ -2585,7 +1730,7 @@
                 <w:rFonts w:ascii="Arial" w:hAnsi="Arial"/>
                 <w:sz w:val="18"/>
               </w:rPr>
-              <w:t>Reason flags</w:t>
+              <w:t>tensorflow` or `keras</w:t>
             </w:r>
           </w:p>
         </w:tc>
@@ -2599,7 +1744,7 @@
                 <w:rFonts w:ascii="Arial" w:hAnsi="Arial"/>
                 <w:sz w:val="18"/>
               </w:rPr>
-              <w:t>Feature families supporting or weakening the prediction.</w:t>
+              <w:t>Neural-network experiments after baseline controls pass.</w:t>
             </w:r>
           </w:p>
         </w:tc>
@@ -2613,7 +1758,7 @@
                 <w:rFonts w:ascii="Arial" w:hAnsi="Arial"/>
                 <w:sz w:val="18"/>
               </w:rPr>
-              <w:t>Not causal proof.</w:t>
+              <w:t>Architecture and validation summaries, not raw models.</w:t>
             </w:r>
           </w:p>
         </w:tc>
@@ -2629,7 +1774,7 @@
                 <w:rFonts w:ascii="Arial" w:hAnsi="Arial"/>
                 <w:sz w:val="18"/>
               </w:rPr>
-              <w:t>Mimic flags</w:t>
+              <w:t>shap</w:t>
             </w:r>
           </w:p>
         </w:tc>
@@ -2643,7 +1788,7 @@
                 <w:rFonts w:ascii="Arial" w:hAnsi="Arial"/>
                 <w:sz w:val="18"/>
               </w:rPr>
-              <w:t>Gas, ice, cement, shale, tight rock, bad-hole, or missing-feature risk.</w:t>
+              <w:t>Feature-influence diagnostics by run and target.</w:t>
             </w:r>
           </w:p>
         </w:tc>
@@ -2657,7 +1802,7 @@
                 <w:rFonts w:ascii="Arial" w:hAnsi="Arial"/>
                 <w:sz w:val="18"/>
               </w:rPr>
-              <w:t>Not final rejection by itself.</w:t>
+              <w:t>Aggregated explanation summaries after approval.</w:t>
             </w:r>
           </w:p>
         </w:tc>
@@ -2673,7 +1818,7 @@
                 <w:rFonts w:ascii="Arial" w:hAnsi="Arial"/>
                 <w:sz w:val="18"/>
               </w:rPr>
-              <w:t>Review exports</w:t>
+              <w:t>python-docx`, `python-pptx</w:t>
             </w:r>
           </w:p>
         </w:tc>
@@ -2687,7 +1832,7 @@
                 <w:rFonts w:ascii="Arial" w:hAnsi="Arial"/>
                 <w:sz w:val="18"/>
               </w:rPr>
-              <w:t>Plots, tables, GIS links, and manuscript figures.</w:t>
+              <w:t>Regenerated mentor documents from reviewed summaries.</w:t>
             </w:r>
           </w:p>
         </w:tc>
@@ -2701,7 +1846,51 @@
                 <w:rFonts w:ascii="Arial" w:hAnsi="Arial"/>
                 <w:sz w:val="18"/>
               </w:rPr>
-              <w:t>Public release only after boundary review.</w:t>
+              <w:t>Updated public-safe Word/PPT deliverables.</w:t>
+            </w:r>
+          </w:p>
+        </w:tc>
+      </w:tr>
+      <w:tr>
+        <w:tc>
+          <w:tcPr>
+            <w:tcW w:type="dxa" w:w="3360"/>
+          </w:tcPr>
+          <w:p>
+            <w:r>
+              <w:rPr>
+                <w:rFonts w:ascii="Arial" w:hAnsi="Arial"/>
+                <w:sz w:val="18"/>
+              </w:rPr>
+              <w:t>Full approved data and label authority</w:t>
+            </w:r>
+          </w:p>
+        </w:tc>
+        <w:tc>
+          <w:tcPr>
+            <w:tcW w:type="dxa" w:w="3360"/>
+          </w:tcPr>
+          <w:p>
+            <w:r>
+              <w:rPr>
+                <w:rFonts w:ascii="Arial" w:hAnsi="Arial"/>
+                <w:sz w:val="18"/>
+              </w:rPr>
+              <w:t>Complete target registry, grouped validation, and final model review.</w:t>
+            </w:r>
+          </w:p>
+        </w:tc>
+        <w:tc>
+          <w:tcPr>
+            <w:tcW w:type="dxa" w:w="3360"/>
+          </w:tcPr>
+          <w:p>
+            <w:r>
+              <w:rPr>
+                <w:rFonts w:ascii="Arial" w:hAnsi="Arial"/>
+                <w:sz w:val="18"/>
+              </w:rPr>
+              <w:t>Final public-safe claims only after mentor approval.</w:t>
             </w:r>
           </w:p>
         </w:tc>
@@ -2713,615 +1902,12 @@
         <w:pStyle w:val="Heading1"/>
       </w:pPr>
       <w:r>
-        <w:t>Source Basis</w:t>
-      </w:r>
-    </w:p>
-    <w:tbl>
-      <w:tblPr>
-        <w:tblStyle w:val="TableGrid"/>
-        <w:tblW w:type="auto" w:w="0"/>
-        <w:tblLook w:firstColumn="1" w:firstRow="1" w:lastColumn="0" w:lastRow="0" w:noHBand="0" w:noVBand="1" w:val="04A0"/>
-      </w:tblPr>
-      <w:tblGrid>
-        <w:gridCol w:w="5040"/>
-        <w:gridCol w:w="5040"/>
-      </w:tblGrid>
-      <w:tr>
-        <w:tc>
-          <w:tcPr>
-            <w:tcW w:type="dxa" w:w="5040"/>
-          </w:tcPr>
-          <w:p>
-            <w:r>
-              <w:rPr>
-                <w:rFonts w:ascii="Arial" w:hAnsi="Arial"/>
-                <w:b/>
-                <w:sz w:val="18"/>
-              </w:rPr>
-              <w:t>Source family</w:t>
-            </w:r>
-          </w:p>
-        </w:tc>
-        <w:tc>
-          <w:tcPr>
-            <w:tcW w:type="dxa" w:w="5040"/>
-          </w:tcPr>
-          <w:p>
-            <w:r>
-              <w:rPr>
-                <w:rFonts w:ascii="Arial" w:hAnsi="Arial"/>
-                <w:b/>
-                <w:sz w:val="18"/>
-              </w:rPr>
-              <w:t>Role in this project</w:t>
-            </w:r>
-          </w:p>
-        </w:tc>
-      </w:tr>
-      <w:tr>
-        <w:tc>
-          <w:tcPr>
-            <w:tcW w:type="dxa" w:w="5040"/>
-          </w:tcPr>
-          <w:p>
-            <w:r>
-              <w:rPr>
-                <w:rFonts w:ascii="Arial" w:hAnsi="Arial"/>
-                <w:sz w:val="18"/>
-              </w:rPr>
-              <w:t>USGS, DOE, and NETL gas hydrate sources</w:t>
-            </w:r>
-          </w:p>
-        </w:tc>
-        <w:tc>
-          <w:tcPr>
-            <w:tcW w:type="dxa" w:w="5040"/>
-          </w:tcPr>
-          <w:p>
-            <w:r>
-              <w:rPr>
-                <w:rFonts w:ascii="Arial" w:hAnsi="Arial"/>
-                <w:sz w:val="18"/>
-              </w:rPr>
-              <w:t>Hydrate definition, North Slope context, and the rule that pressure, temperature, salinity, and gas composition control stability.</w:t>
-            </w:r>
-          </w:p>
-        </w:tc>
-      </w:tr>
-      <w:tr>
-        <w:tc>
-          <w:tcPr>
-            <w:tcW w:type="dxa" w:w="5040"/>
-          </w:tcPr>
-          <w:p>
-            <w:r>
-              <w:rPr>
-                <w:rFonts w:ascii="Arial" w:hAnsi="Arial"/>
-                <w:sz w:val="18"/>
-              </w:rPr>
-              <w:t>USGS SIR 2008-5175</w:t>
-            </w:r>
-          </w:p>
-        </w:tc>
-        <w:tc>
-          <w:tcPr>
-            <w:tcW w:type="dxa" w:w="5040"/>
-          </w:tcPr>
-          <w:p>
-            <w:r>
-              <w:rPr>
-                <w:rFonts w:ascii="Arial" w:hAnsi="Arial"/>
-                <w:sz w:val="18"/>
-              </w:rPr>
-              <w:t>Method anchor for intersecting wellbore temperature profiles with a methane hydrate phase boundary.</w:t>
-            </w:r>
-          </w:p>
-        </w:tc>
-      </w:tr>
-      <w:tr>
-        <w:tc>
-          <w:tcPr>
-            <w:tcW w:type="dxa" w:w="5040"/>
-          </w:tcPr>
-          <w:p>
-            <w:r>
-              <w:rPr>
-                <w:rFonts w:ascii="Arial" w:hAnsi="Arial"/>
-                <w:sz w:val="18"/>
-              </w:rPr>
-              <w:t>NSIDC GGD223 and G10015</w:t>
-            </w:r>
-          </w:p>
-        </w:tc>
-        <w:tc>
-          <w:tcPr>
-            <w:tcW w:type="dxa" w:w="5040"/>
-          </w:tcPr>
-          <w:p>
-            <w:r>
-              <w:rPr>
-                <w:rFonts w:ascii="Arial" w:hAnsi="Arial"/>
-                <w:sz w:val="18"/>
-              </w:rPr>
-              <w:t>Public permafrost-depth controls and processed Arctic Slope temperature profiles.</w:t>
-            </w:r>
-          </w:p>
-        </w:tc>
-      </w:tr>
-      <w:tr>
-        <w:tc>
-          <w:tcPr>
-            <w:tcW w:type="dxa" w:w="5040"/>
-          </w:tcPr>
-          <w:p>
-            <w:r>
-              <w:rPr>
-                <w:rFonts w:ascii="Arial" w:hAnsi="Arial"/>
-                <w:sz w:val="18"/>
-              </w:rPr>
-              <w:t>USGS OM-222</w:t>
-            </w:r>
-          </w:p>
-        </w:tc>
-        <w:tc>
-          <w:tcPr>
-            <w:tcW w:type="dxa" w:w="5040"/>
-          </w:tcPr>
-          <w:p>
-            <w:r>
-              <w:rPr>
-                <w:rFonts w:ascii="Arial" w:hAnsi="Arial"/>
-                <w:sz w:val="18"/>
-              </w:rPr>
-              <w:t>Preferred future mapped base-of-ice-bearing-permafrost surface after digitizing/georeferencing.</w:t>
-            </w:r>
-          </w:p>
-        </w:tc>
-      </w:tr>
-      <w:tr>
-        <w:tc>
-          <w:tcPr>
-            <w:tcW w:type="dxa" w:w="5040"/>
-          </w:tcPr>
-          <w:p>
-            <w:r>
-              <w:rPr>
-                <w:rFonts w:ascii="Arial" w:hAnsi="Arial"/>
-                <w:sz w:val="18"/>
-              </w:rPr>
-              <w:t>Lee and Collett (2011), Haines et al. (2022), Aung et al. (2026), Yoneda et al. (2026)</w:t>
-            </w:r>
-          </w:p>
-        </w:tc>
-        <w:tc>
-          <w:tcPr>
-            <w:tcW w:type="dxa" w:w="5040"/>
-          </w:tcPr>
-          <w:p>
-            <w:r>
-              <w:rPr>
-                <w:rFonts w:ascii="Arial" w:hAnsi="Arial"/>
-                <w:sz w:val="18"/>
-              </w:rPr>
-              <w:t>North Slope hydrate, log-response, NMR/core, reservoir, QC, and producibility context.</w:t>
-            </w:r>
-          </w:p>
-        </w:tc>
-      </w:tr>
-      <w:tr>
-        <w:tc>
-          <w:tcPr>
-            <w:tcW w:type="dxa" w:w="5040"/>
-          </w:tcPr>
-          <w:p>
-            <w:r>
-              <w:rPr>
-                <w:rFonts w:ascii="Arial" w:hAnsi="Arial"/>
-                <w:sz w:val="18"/>
-              </w:rPr>
-              <w:t>Chong et al. (2022)</w:t>
-            </w:r>
-          </w:p>
-        </w:tc>
-        <w:tc>
-          <w:tcPr>
-            <w:tcW w:type="dxa" w:w="5040"/>
-          </w:tcPr>
-          <w:p>
-            <w:r>
-              <w:rPr>
-                <w:rFonts w:ascii="Arial" w:hAnsi="Arial"/>
-                <w:sz w:val="18"/>
-              </w:rPr>
-              <w:t>Direct permafrost-associated gas-hydrate ML analogue using well-log inputs and saturation references.</w:t>
-            </w:r>
-          </w:p>
-        </w:tc>
-      </w:tr>
-      <w:tr>
-        <w:tc>
-          <w:tcPr>
-            <w:tcW w:type="dxa" w:w="5040"/>
-          </w:tcPr>
-          <w:p>
-            <w:r>
-              <w:rPr>
-                <w:rFonts w:ascii="Arial" w:hAnsi="Arial"/>
-                <w:sz w:val="18"/>
-              </w:rPr>
-              <w:t>Singh et al. (2021)</w:t>
-            </w:r>
-          </w:p>
-        </w:tc>
-        <w:tc>
-          <w:tcPr>
-            <w:tcW w:type="dxa" w:w="5040"/>
-          </w:tcPr>
-          <w:p>
-            <w:r>
-              <w:rPr>
-                <w:rFonts w:ascii="Arial" w:hAnsi="Arial"/>
-                <w:sz w:val="18"/>
-              </w:rPr>
-              <w:t>Comparative saturation ML and optimal well-log feature support.</w:t>
-            </w:r>
-          </w:p>
-        </w:tc>
-      </w:tr>
-      <w:tr>
-        <w:tc>
-          <w:tcPr>
-            <w:tcW w:type="dxa" w:w="5040"/>
-          </w:tcPr>
-          <w:p>
-            <w:r>
-              <w:rPr>
-                <w:rFonts w:ascii="Arial" w:hAnsi="Arial"/>
-                <w:sz w:val="18"/>
-              </w:rPr>
-              <w:t>Chong et al. (2024)</w:t>
-            </w:r>
-          </w:p>
-        </w:tc>
-        <w:tc>
-          <w:tcPr>
-            <w:tcW w:type="dxa" w:w="5040"/>
-          </w:tcPr>
-          <w:p>
-            <w:r>
-              <w:rPr>
-                <w:rFonts w:ascii="Arial" w:hAnsi="Arial"/>
-                <w:sz w:val="18"/>
-              </w:rPr>
-              <w:t>Comparative occurrence plus saturation ML architecture support.</w:t>
-            </w:r>
-          </w:p>
-        </w:tc>
-      </w:tr>
-      <w:tr>
-        <w:tc>
-          <w:tcPr>
-            <w:tcW w:type="dxa" w:w="5040"/>
-          </w:tcPr>
-          <w:p>
-            <w:r>
-              <w:rPr>
-                <w:rFonts w:ascii="Arial" w:hAnsi="Arial"/>
-                <w:sz w:val="18"/>
-              </w:rPr>
-              <w:t>Tian et al. (2023), Li and Liu (2020), Naim et al. (2023)</w:t>
-            </w:r>
-          </w:p>
-        </w:tc>
-        <w:tc>
-          <w:tcPr>
-            <w:tcW w:type="dxa" w:w="5040"/>
-          </w:tcPr>
-          <w:p>
-            <w:r>
-              <w:rPr>
-                <w:rFonts w:ascii="Arial" w:hAnsi="Arial"/>
-                <w:sz w:val="18"/>
-              </w:rPr>
-              <w:t>Comparative model options for classification, sequence modeling, and missing-log adapters.</w:t>
-            </w:r>
-          </w:p>
-        </w:tc>
-      </w:tr>
-      <w:tr>
-        <w:tc>
-          <w:tcPr>
-            <w:tcW w:type="dxa" w:w="5040"/>
-          </w:tcPr>
-          <w:p>
-            <w:r>
-              <w:rPr>
-                <w:rFonts w:ascii="Arial" w:hAnsi="Arial"/>
-                <w:sz w:val="18"/>
-              </w:rPr>
-              <w:t>Cook and Waite (2018)</w:t>
-            </w:r>
-          </w:p>
-        </w:tc>
-        <w:tc>
-          <w:tcPr>
-            <w:tcW w:type="dxa" w:w="5040"/>
-          </w:tcPr>
-          <w:p>
-            <w:r>
-              <w:rPr>
-                <w:rFonts w:ascii="Arial" w:hAnsi="Arial"/>
-                <w:sz w:val="18"/>
-              </w:rPr>
-              <w:t>Archie saturation exponent and petrophysical saturation caution.</w:t>
-            </w:r>
-          </w:p>
-        </w:tc>
-      </w:tr>
-      <w:tr>
-        <w:tc>
-          <w:tcPr>
-            <w:tcW w:type="dxa" w:w="5040"/>
-          </w:tcPr>
-          <w:p>
-            <w:r>
-              <w:rPr>
-                <w:rFonts w:ascii="Arial" w:hAnsi="Arial"/>
-                <w:sz w:val="18"/>
-              </w:rPr>
-              <w:t>Project documents</w:t>
-            </w:r>
-          </w:p>
-        </w:tc>
-        <w:tc>
-          <w:tcPr>
-            <w:tcW w:type="dxa" w:w="5040"/>
-          </w:tcPr>
-          <w:p>
-            <w:r>
-              <w:rPr>
-                <w:rFonts w:ascii="Arial" w:hAnsi="Arial"/>
-                <w:sz w:val="18"/>
-              </w:rPr>
-              <w:t>`SCIENCE_TO_ML_LOGIC_LADDER`, `ML_PIPELINE_BASELINE_SOURCE_LEDGER`, `WELL_LOG_REQUIREMENTS_MAP`, `STABILITY_CALCULATION_PLAN`, and runtime docs define the current implementation contract.</w:t>
-            </w:r>
-          </w:p>
-        </w:tc>
-      </w:tr>
-    </w:tbl>
-    <w:p/>
-    <w:p>
-      <w:pPr>
-        <w:pStyle w:val="Heading1"/>
-      </w:pPr>
-      <w:r>
-        <w:t>What Is Complete</w:t>
-      </w:r>
-    </w:p>
-    <w:p>
-      <w:pPr>
-        <w:pStyle w:val="ListBullet"/>
-      </w:pPr>
-      <w:r>
-        <w:t>Public GitHub/Streamlit scaffold and public data boundary.</w:t>
-      </w:r>
-    </w:p>
-    <w:p>
-      <w:pPr>
-        <w:pStyle w:val="ListBullet"/>
-      </w:pPr>
-      <w:r>
-        <w:t>OpenScienceLab/public-delivery division.</w:t>
-      </w:r>
-    </w:p>
-    <w:p>
-      <w:pPr>
-        <w:pStyle w:val="ListBullet"/>
-      </w:pPr>
-      <w:r>
-        <w:t>Public stability scaffold for 8,084 Arctic Slope public wells.</w:t>
-      </w:r>
-    </w:p>
-    <w:p>
-      <w:pPr>
-        <w:pStyle w:val="ListBullet"/>
-      </w:pPr>
-      <w:r>
-        <w:t>G10015 temperature inventory summary with 184 profiles across 24 well codes.</w:t>
-      </w:r>
-    </w:p>
-    <w:p>
-      <w:pPr>
-        <w:pStyle w:val="ListBullet"/>
-      </w:pPr>
-      <w:r>
-        <w:t>Temperature-model product with calculated, extrapolated, and blocked</w:t>
+        <w:t>Mentor Questions And Decisions</w:t>
       </w:r>
     </w:p>
     <w:p>
       <w:r>
-        <w:t>key-depth rows.</w:t>
-      </w:r>
-    </w:p>
-    <w:p>
-      <w:pPr>
-        <w:pStyle w:val="ListBullet"/>
-      </w:pPr>
-      <w:r>
-        <w:t>Cited methane 5 ppt phase-curve lookup.</w:t>
-      </w:r>
-    </w:p>
-    <w:p>
-      <w:pPr>
-        <w:pStyle w:val="ListBullet"/>
-      </w:pPr>
-      <w:r>
-        <w:t>Hydrostatic pressure helper logic.</w:t>
-      </w:r>
-    </w:p>
-    <w:p>
-      <w:pPr>
-        <w:pStyle w:val="ListBullet"/>
-      </w:pPr>
-      <w:r>
-        <w:t>Temperature-model logic and duplicate-depth handling.</w:t>
-      </w:r>
-    </w:p>
-    <w:p>
-      <w:pPr>
-        <w:pStyle w:val="ListBullet"/>
-      </w:pPr>
-      <w:r>
-        <w:t>Source-control confidence labels.</w:t>
-      </w:r>
-    </w:p>
-    <w:p>
-      <w:pPr>
-        <w:pStyle w:val="ListBullet"/>
-      </w:pPr>
-      <w:r>
-        <w:t>Guarded baseline stability-screen writer and public display.</w:t>
-      </w:r>
-    </w:p>
-    <w:p>
-      <w:pPr>
-        <w:pStyle w:val="ListBullet"/>
-      </w:pPr>
-      <w:r>
-        <w:t>Communication drafts and slide remake that preserve the no-proof guardrail.</w:t>
-      </w:r>
-    </w:p>
-    <w:p>
-      <w:pPr>
-        <w:pStyle w:val="Heading1"/>
-      </w:pPr>
-      <w:r>
-        <w:t>What Is Calculated</w:t>
-      </w:r>
-    </w:p>
-    <w:p>
-      <w:pPr>
-        <w:pStyle w:val="ListBullet"/>
-      </w:pPr>
-      <w:r>
-        <w:t>919 temperature key-depth rows are calculated.</w:t>
-      </w:r>
-    </w:p>
-    <w:p>
-      <w:pPr>
-        <w:pStyle w:val="ListBullet"/>
-      </w:pPr>
-      <w:r>
-        <w:t>387 of those calculated key-depth rows are extrapolated below measured</w:t>
-      </w:r>
-    </w:p>
-    <w:p>
-      <w:r>
-        <w:t>profile coverage.</w:t>
-      </w:r>
-    </w:p>
-    <w:p>
-      <w:pPr>
-        <w:pStyle w:val="ListBullet"/>
-      </w:pPr>
-      <w:r>
-        <w:t>22 baseline methane 5 ppt stability-admissibility intervals are calculated.</w:t>
-      </w:r>
-    </w:p>
-    <w:p>
-      <w:pPr>
-        <w:pStyle w:val="ListBullet"/>
-      </w:pPr>
-      <w:r>
-        <w:t>8 rows had sufficient inputs but no modeled stable interval under the</w:t>
-      </w:r>
-    </w:p>
-    <w:p>
-      <w:r>
-        <w:t>baseline run.</w:t>
-      </w:r>
-    </w:p>
-    <w:p>
-      <w:r>
-        <w:t>These are calculation statuses. They are not hydrate detections.</w:t>
-      </w:r>
-    </w:p>
-    <w:p>
-      <w:pPr>
-        <w:pStyle w:val="Heading1"/>
-      </w:pPr>
-      <w:r>
-        <w:t>What Is Intentionally Blocked</w:t>
-      </w:r>
-    </w:p>
-    <w:p>
-      <w:pPr>
-        <w:pStyle w:val="ListBullet"/>
-      </w:pPr>
-      <w:r>
-        <w:t>15,249 temperature key-depth rows are blocked because required profile/depth</w:t>
-      </w:r>
-    </w:p>
-    <w:p>
-      <w:r>
-        <w:t>inputs are missing or insufficient.</w:t>
-      </w:r>
-    </w:p>
-    <w:p>
-      <w:pPr>
-        <w:pStyle w:val="ListBullet"/>
-      </w:pPr>
-      <w:r>
-        <w:t>8,054 stability-screen rows are blocked because at least one source or</w:t>
-      </w:r>
-    </w:p>
-    <w:p>
-      <w:r>
-        <w:t>calculation gate did not pass.</w:t>
-      </w:r>
-    </w:p>
-    <w:p>
-      <w:pPr>
-        <w:pStyle w:val="ListBullet"/>
-      </w:pPr>
-      <w:r>
-        <w:t>Approved well-log rows, core rows, target labels, trained models, and</w:t>
-      </w:r>
-    </w:p>
-    <w:p>
-      <w:r>
-        <w:t>runtime metrics remain outside public GitHub/Streamlit.</w:t>
-      </w:r>
-    </w:p>
-    <w:p>
-      <w:pPr>
-        <w:pStyle w:val="ListBullet"/>
-      </w:pPr>
-      <w:r>
-        <w:t>Final occurrence labels, saturation targets, and project ML metrics remain</w:t>
-      </w:r>
-    </w:p>
-    <w:p>
-      <w:r>
-        <w:t>blocked until approved-data execution.</w:t>
-      </w:r>
-    </w:p>
-    <w:p>
-      <w:r>
-        <w:t>Blocked does not mean no hydrate. Blocked means the workflow is refusing to</w:t>
-      </w:r>
-    </w:p>
-    <w:p>
-      <w:r>
-        <w:t>make a claim without the required inputs.</w:t>
-      </w:r>
-    </w:p>
-    <w:p>
-      <w:pPr>
-        <w:pStyle w:val="Heading1"/>
-      </w:pPr>
-      <w:r>
-        <w:t>Next Decisions</w:t>
+        <w:t>These decisions should be reviewed before the next model-claim step:</w:t>
       </w:r>
     </w:p>
     <w:p>
@@ -3329,12 +1915,7 @@
         <w:pStyle w:val="ListNumber"/>
       </w:pPr>
       <w:r>
-        <w:t>Keep the official baseline as 100 percent methane plus 5 ppt salinity, or</w:t>
-      </w:r>
-    </w:p>
-    <w:p>
-      <w:r>
-        <w:t>choose a replacement phase-curve model/source.</w:t>
+        <w:t>Which saturation field is authoritative for training and validation: `Sgh`, `S_h`, `Sh`, `NMR_SAT`, or another reviewed label?</w:t>
       </w:r>
     </w:p>
     <w:p>
@@ -3342,12 +1923,7 @@
         <w:pStyle w:val="ListNumber"/>
       </w:pPr>
       <w:r>
-        <w:t>Decide whether the Collett et al. (2011) / Holder et al. (1987) mixed-gas</w:t>
-      </w:r>
-    </w:p>
-    <w:p>
-      <w:r>
-        <w:t>curve should be digitized or model-generated as sensitivity only.</w:t>
+        <w:t>Are saturation targets stored as fractions, percentages, or mixed conventions by sheet?</w:t>
       </w:r>
     </w:p>
     <w:p>
@@ -3355,12 +1931,7 @@
         <w:pStyle w:val="ListNumber"/>
       </w:pPr>
       <w:r>
-        <w:t>Define high, medium, and low source-control thresholds for temperature and</w:t>
-      </w:r>
-    </w:p>
-    <w:p>
-      <w:r>
-        <w:t>permafrost control distance.</w:t>
+        <w:t>How should occurrence be defined: phase labels, saturation threshold, source classes, or mentor-reviewed intervals?</w:t>
       </w:r>
     </w:p>
     <w:p>
@@ -3368,7 +1939,7 @@
         <w:pStyle w:val="ListNumber"/>
       </w:pPr>
       <w:r>
-        <w:t>Decide whether OM-222 permafrost base should be digitized next.</w:t>
+        <w:t>Which wells or compartments become training, validation, and locked-test groups?</w:t>
       </w:r>
     </w:p>
     <w:p>
@@ -3376,12 +1947,7 @@
         <w:pStyle w:val="ListNumber"/>
       </w:pPr>
       <w:r>
-        <w:t>Confirm which approved well-log/core/NMR fields can be used for occurrence</w:t>
-      </w:r>
-    </w:p>
-    <w:p>
-      <w:r>
-        <w:t>labels, saturation regression targets, calibration, and validation.</w:t>
+        <w:t>Should depth stay only as alignment/context, or can a reviewed depth/context feature enter `X_allowed`?</w:t>
       </w:r>
     </w:p>
     <w:p>
@@ -3389,12 +1955,7 @@
         <w:pStyle w:val="ListNumber"/>
       </w:pPr>
       <w:r>
-        <w:t>Confirm whether the final ML workflow should always present occurrence</w:t>
-      </w:r>
-    </w:p>
-    <w:p>
-      <w:r>
-        <w:t>classification and saturation regression as two linked outputs.</w:t>
+        <w:t>Which resistivity fields, such as `A090` or `AF90`, are the preferred deep resistivity predictors?</w:t>
       </w:r>
     </w:p>
     <w:p>
@@ -3402,12 +1963,31 @@
         <w:pStyle w:val="ListNumber"/>
       </w:pPr>
       <w:r>
-        <w:t>Recover the full workbook/formulas so the header map can become a complete</w:t>
+        <w:t>Which NMR fields are measured inputs versus target-derived labels?</w:t>
       </w:r>
     </w:p>
     <w:p>
+      <w:pPr>
+        <w:pStyle w:val="ListNumber"/>
+      </w:pPr>
       <w:r>
-        <w:t>runtime input contract.</w:t>
+        <w:t>Is caliper coverage sufficient for washout filtering, or should it remain a missing-QC flag?</w:t>
+      </w:r>
+    </w:p>
+    <w:p>
+      <w:pPr>
+        <w:pStyle w:val="ListNumber"/>
+      </w:pPr>
+      <w:r>
+        <w:t>Are missing-log adapters allowed, and if so, how should measured versus generated curves be flagged?</w:t>
+      </w:r>
+    </w:p>
+    <w:p>
+      <w:pPr>
+        <w:pStyle w:val="ListNumber"/>
+      </w:pPr>
+      <w:r>
+        <w:t>Should stability be used only as context/confidence/reason flag, or also as a mentor-approved mask?</w:t>
       </w:r>
     </w:p>
     <w:p>
@@ -3419,255 +1999,34 @@
       </w:r>
     </w:p>
     <w:p>
-      <w:r>
-        <w:t>The next practical sequence is:</w:t>
-      </w:r>
-    </w:p>
-    <w:p>
       <w:pPr/>
       <w:r>
         <w:rPr>
           <w:rFonts w:ascii="Consolas" w:hAnsi="Consolas"/>
           <w:sz w:val="18"/>
         </w:rPr>
-        <w:t>review this pipeline brief</w:t>
+        <w:t>review this companion brief</w:t>
         <w:br/>
-        <w:t>-&gt; align Word document and 9-slide deck language</w:t>
+        <w:t>-&gt; inspect DOE prototype audit outputs</w:t>
         <w:br/>
-        <w:t>-&gt; recover workbook/formula details</w:t>
+        <w:t>-&gt; confirm target authority and units</w:t>
         <w:br/>
-        <w:t>-&gt; finalize target registry and leakage barrier</w:t>
+        <w:t>-&gt; lock X_allowed / Y-only field policy</w:t>
         <w:br/>
-        <w:t>-&gt; configure approved runtime in OpenScienceLab/DOE environment</w:t>
+        <w:t>-&gt; choose grouped validation split</w:t>
         <w:br/>
-        <w:t>-&gt; load approved logs/core/NMR</w:t>
+        <w:t>-&gt; join stability context as non-label metadata</w:t>
         <w:br/>
-        <w:t>-&gt; run QC, alignment, and feature engineering</w:t>
+        <w:t>-&gt; rerun baseline models in DOE</w:t>
         <w:br/>
-        <w:t>-&gt; train baseline occurrence and saturation models</w:t>
+        <w:t>-&gt; review external or whole-workbook validation</w:t>
         <w:br/>
-        <w:t>-&gt; validate by complete wells or compartments</w:t>
-        <w:br/>
-        <w:t>-&gt; export approved figures and public-safe summaries</w:t>
+        <w:t>-&gt; export only row-free public-safe summaries</w:t>
       </w:r>
     </w:p>
     <w:p>
       <w:r>
-        <w:t>Until approved-data validation exists, the public deliverables should emphasize</w:t>
-      </w:r>
-    </w:p>
-    <w:p>
-      <w:r>
-        <w:t>workflow readiness, source traceability, stability-admissibility, and blocked</w:t>
-      </w:r>
-    </w:p>
-    <w:p>
-      <w:r>
-        <w:t>states rather than presenting hydrate discoveries or model performance.</w:t>
-      </w:r>
-    </w:p>
-    <w:p>
-      <w:pPr>
-        <w:pStyle w:val="Heading1"/>
-      </w:pPr>
-      <w:r>
-        <w:t>Claims To Avoid</w:t>
-      </w:r>
-    </w:p>
-    <w:p>
-      <w:pPr>
-        <w:pStyle w:val="ListBullet"/>
-      </w:pPr>
-      <w:r>
-        <w:t>High resistivity proves hydrate.</w:t>
-      </w:r>
-    </w:p>
-    <w:p>
-      <w:pPr>
-        <w:pStyle w:val="ListBullet"/>
-      </w:pPr>
-      <w:r>
-        <w:t>Low gamma ray proves hydrate.</w:t>
-      </w:r>
-    </w:p>
-    <w:p>
-      <w:pPr>
-        <w:pStyle w:val="ListBullet"/>
-      </w:pPr>
-      <w:r>
-        <w:t>All clean sand in the stability zone contains hydrate.</w:t>
-      </w:r>
-    </w:p>
-    <w:p>
-      <w:pPr>
-        <w:pStyle w:val="ListBullet"/>
-      </w:pPr>
-      <w:r>
-        <w:t>The 22 calculated intervals are hydrate detections.</w:t>
-      </w:r>
-    </w:p>
-    <w:p>
-      <w:pPr>
-        <w:pStyle w:val="ListBullet"/>
-      </w:pPr>
-      <w:r>
-        <w:t>Blocked rows are no-hydrate rows.</w:t>
-      </w:r>
-    </w:p>
-    <w:p>
-      <w:pPr>
-        <w:pStyle w:val="ListBullet"/>
-      </w:pPr>
-      <w:r>
-        <w:t>Public scaffold wells are approved-runtime training wells.</w:t>
-      </w:r>
-    </w:p>
-    <w:p>
-      <w:pPr>
-        <w:pStyle w:val="ListBullet"/>
-      </w:pPr>
-      <w:r>
-        <w:t>Comparative ML papers validate this project's final accuracy.</w:t>
-      </w:r>
-    </w:p>
-    <w:p>
-      <w:pPr>
-        <w:pStyle w:val="ListBullet"/>
-      </w:pPr>
-      <w:r>
-        <w:t>Random row validation is final validation.</w:t>
-      </w:r>
-    </w:p>
-    <w:p>
-      <w:pPr>
-        <w:pStyle w:val="ListBullet"/>
-      </w:pPr>
-      <w:r>
-        <w:t>`S_h`, `Sgh`, `NMR_SAT`, phase labels, or rankings are predictors.</w:t>
-      </w:r>
-    </w:p>
-    <w:p>
-      <w:pPr>
-        <w:pStyle w:val="ListBullet"/>
-      </w:pPr>
-      <w:r>
-        <w:t>Screening ranges are final DOE thresholds.</w:t>
-      </w:r>
-    </w:p>
-    <w:p>
-      <w:pPr>
-        <w:pStyle w:val="ListBullet"/>
-      </w:pPr>
-      <w:r>
-        <w:t>The project has final hydrate saturation results before approved-data</w:t>
-      </w:r>
-    </w:p>
-    <w:p>
-      <w:r>
-        <w:t>validation.</w:t>
-      </w:r>
-    </w:p>
-    <w:p>
-      <w:pPr>
-        <w:pStyle w:val="Heading1"/>
-      </w:pPr>
-      <w:r>
-        <w:t>Word And Slide Translation</w:t>
-      </w:r>
-    </w:p>
-    <w:p>
-      <w:r>
-        <w:t>The Word document should use this brief to explain the project in this order:</w:t>
-      </w:r>
-    </w:p>
-    <w:p>
-      <w:pPr/>
-      <w:r>
-        <w:rPr>
-          <w:rFonts w:ascii="Consolas" w:hAnsi="Consolas"/>
-          <w:sz w:val="18"/>
-        </w:rPr>
-        <w:t>current status</w:t>
-        <w:br/>
-        <w:t>-&gt; target hydrate system</w:t>
-        <w:br/>
-        <w:t>-&gt; public/runtime boundary</w:t>
-        <w:br/>
-        <w:t>-&gt; stability-admissibility screen</w:t>
-        <w:br/>
-        <w:t>-&gt; evidence tiers</w:t>
-        <w:br/>
-        <w:t>-&gt; ML pipeline</w:t>
-        <w:br/>
-        <w:t>-&gt; validation and outputs</w:t>
-        <w:br/>
-        <w:t>-&gt; open decisions and next work</w:t>
-      </w:r>
-    </w:p>
-    <w:p>
-      <w:r>
-        <w:t>The nine-slide deck should keep slides 1 and 2 from the current Gmail authority</w:t>
-      </w:r>
-    </w:p>
-    <w:p>
-      <w:r>
-        <w:t>deck, then use slides 3-9 to show:</w:t>
-      </w:r>
-    </w:p>
-    <w:p>
-      <w:pPr>
-        <w:pStyle w:val="ListBullet"/>
-      </w:pPr>
-      <w:r>
-        <w:t>evidence tiers, not a flat parameter list;</w:t>
-      </w:r>
-    </w:p>
-    <w:p>
-      <w:pPr>
-        <w:pStyle w:val="ListBullet"/>
-      </w:pPr>
-      <w:r>
-        <w:t>public GitHub/Streamlit versus OpenScienceLab;</w:t>
-      </w:r>
-    </w:p>
-    <w:p>
-      <w:pPr>
-        <w:pStyle w:val="ListBullet"/>
-      </w:pPr>
-      <w:r>
-        <w:t>why hydrate signals have mimics;</w:t>
-      </w:r>
-    </w:p>
-    <w:p>
-      <w:pPr>
-        <w:pStyle w:val="ListBullet"/>
-      </w:pPr>
-      <w:r>
-        <w:t>physics features and stability context;</w:t>
-      </w:r>
-    </w:p>
-    <w:p>
-      <w:pPr>
-        <w:pStyle w:val="ListBullet"/>
-      </w:pPr>
-      <w:r>
-        <w:t>public stability products as readiness, not proof;</w:t>
-      </w:r>
-    </w:p>
-    <w:p>
-      <w:pPr>
-        <w:pStyle w:val="ListBullet"/>
-      </w:pPr>
-      <w:r>
-        <w:t>complete/calculated/blocked/future status;</w:t>
-      </w:r>
-    </w:p>
-    <w:p>
-      <w:pPr>
-        <w:pStyle w:val="ListBullet"/>
-      </w:pPr>
-      <w:r>
-        <w:t>mentor decisions before prediction claims.</w:t>
+        <w:t>Until approved-data validation exists, the website, slides, and Word documents should emphasize workflow readiness, source traceability, auditability, stability-admissibility, and blocked states rather than presenting discoveries or model performance.</w:t>
       </w:r>
     </w:p>
     <w:p>

</xml_diff>